<commit_message>
SA2 S1: Fig.2 amb final de telofase (quadre 7), guia docent i exit tickets C
Co-Authored-By: Claude Opus 5.5 <noreply@anthropic.com>
</commit_message>
<xml_diff>
--- a/public/docs/sa2-guia-docent.docx
+++ b/public/docs/sa2-guia-docent.docx
@@ -2598,6 +2598,41 @@
                 <w:sz w:val="18"/>
               </w:rPr>
               <w:t xml:space="preserve"> una telofase amb dos nuclis encara és 1 cèl·lula. Dir-ho abans que comptin.</w:t>
+            </w:r>
+          </w:p>
+          <w:p>
+            <w:pPr>
+              <w:spacing w:after="20" w:before="0"/>
+            </w:pPr>
+            <w:r>
+              <w:rPr>
+                <w:rFonts w:ascii="Fira Sans Extra Condensed" w:hAnsi="Fira Sans Extra Condensed" w:cs="Fira Sans Extra Condensed"/>
+                <w:b/>
+                <w:i w:val="0"/>
+                <w:color w:val="7B3F9E"/>
+                <w:sz w:val="18"/>
+              </w:rPr>
+              <w:t xml:space="preserve">• </w:t>
+            </w:r>
+            <w:r>
+              <w:rPr>
+                <w:rFonts w:ascii="Fira Sans Extra Condensed" w:hAnsi="Fira Sans Extra Condensed" w:cs="Fira Sans Extra Condensed"/>
+                <w:b/>
+                <w:i w:val="0"/>
+                <w:color w:val="1A1A2E"/>
+                <w:sz w:val="18"/>
+              </w:rPr>
+              <w:t>Quadre 7 (final de la telofase):</w:t>
+            </w:r>
+            <w:r>
+              <w:rPr>
+                <w:rFonts w:ascii="Fira Sans Extra Condensed" w:hAnsi="Fira Sans Extra Condensed" w:cs="Fira Sans Extra Condensed"/>
+                <w:b w:val="0"/>
+                <w:i w:val="0"/>
+                <w:color w:val="1A1A2E"/>
+                <w:sz w:val="18"/>
+              </w:rPr>
+              <w:t xml:space="preserve"> la paret nova ja és sencera i a cada cèl·lula filla l'ADN torna a ser un núvol. S'assembla a la interfase: preguntar «per què n'hi ha dues en un quadre?». Compta com 1 telofase. Recompte: interfase 5 (1, 3, 5, 9, 10) · profase 1 (6) · metafase 1 (2) · anafase 1 (8) · telofase 2 (4, 7). A la C (núvol o fils) el 7 pot anar a «repòs» si ho justifiquen.</w:t>
             </w:r>
           </w:p>
           <w:p>

</xml_diff>

<commit_message>
Material gràfic a la web de 4t: 11 figures (Commons lliure o dibuix propi) a SA2, SA4, SA5 i SA7, i als PDF de teoria
Co-Authored-By: Claude Sonnet 5.5 <noreply@anthropic.com>
</commit_message>
<xml_diff>
--- a/public/docs/sa2-guia-docent.docx
+++ b/public/docs/sa2-guia-docent.docx
@@ -2343,7 +2343,7 @@
                 <w:color w:val="666666"/>
                 <w:sz w:val="17"/>
               </w:rPr>
-              <w:t>10 min (A: 8) · apartat 0</w:t>
+              <w:t>10 min (A: 5) · apartat 0</w:t>
             </w:r>
           </w:p>
         </w:tc>
@@ -2487,7 +2487,7 @@
                 <w:color w:val="666666"/>
                 <w:sz w:val="17"/>
               </w:rPr>
-              <w:t>40 min · apartat 1</w:t>
+              <w:t>40 min (A: 42) · apartat 1</w:t>
             </w:r>
           </w:p>
         </w:tc>
@@ -2761,7 +2761,7 @@
                 <w:color w:val="666666"/>
                 <w:sz w:val="17"/>
               </w:rPr>
-              <w:t>20 min (A: 18) · apartat 2</w:t>
+              <w:t>20 min · apartat 2</w:t>
             </w:r>
           </w:p>
         </w:tc>
@@ -2965,7 +2965,7 @@
                 <w:color w:val="666666"/>
                 <w:sz w:val="17"/>
               </w:rPr>
-              <w:t>20 min (A: 15) · apartat 3</w:t>
+              <w:t>20 min (A: 18) · apartat 3</w:t>
             </w:r>
           </w:p>
         </w:tc>
@@ -4441,7 +4441,7 @@
                 <w:color w:val="666666"/>
                 <w:sz w:val="17"/>
               </w:rPr>
-              <w:t>10 min (A: 8) · apartat 0</w:t>
+              <w:t>10 min (A: 5) · apartat 0</w:t>
             </w:r>
           </w:p>
         </w:tc>
@@ -4585,7 +4585,7 @@
                 <w:color w:val="666666"/>
                 <w:sz w:val="17"/>
               </w:rPr>
-              <w:t>40 min (A: 47) · apartat 1</w:t>
+              <w:t>40 min (A: 48) · apartat 1</w:t>
             </w:r>
           </w:p>
         </w:tc>
@@ -4859,7 +4859,7 @@
                 <w:color w:val="666666"/>
                 <w:sz w:val="17"/>
               </w:rPr>
-              <w:t>20 min · apartat 2</w:t>
+              <w:t>20 min (A: 22) · apartat 2</w:t>
             </w:r>
           </w:p>
         </w:tc>
@@ -5003,7 +5003,7 @@
                 <w:color w:val="666666"/>
                 <w:sz w:val="17"/>
               </w:rPr>
-              <w:t>20 min (A: 15) · apartat 3</w:t>
+              <w:t>20 min (A: 18) · apartat 3</w:t>
             </w:r>
           </w:p>
         </w:tc>
@@ -5182,7 +5182,7 @@
                 <w:color w:val="666666"/>
                 <w:sz w:val="17"/>
               </w:rPr>
-              <w:t>20 min (A: 16) · apartat 4</w:t>
+              <w:t>20 min (A: 17) · apartat 4</w:t>
             </w:r>
           </w:p>
         </w:tc>
@@ -6539,7 +6539,7 @@
                 <w:color w:val="666666"/>
                 <w:sz w:val="17"/>
               </w:rPr>
-              <w:t>10 min (A: 8) · apartat 0</w:t>
+              <w:t>10 min (A: 5) · apartat 0</w:t>
             </w:r>
           </w:p>
         </w:tc>
@@ -6683,7 +6683,7 @@
                 <w:color w:val="666666"/>
                 <w:sz w:val="17"/>
               </w:rPr>
-              <w:t>40 min (A: 44) · apartat 1</w:t>
+              <w:t>40 min (A: 45) · apartat 1</w:t>
             </w:r>
           </w:p>
         </w:tc>
@@ -6971,7 +6971,7 @@
                 <w:color w:val="666666"/>
                 <w:sz w:val="17"/>
               </w:rPr>
-              <w:t>25 min (A: 27) · apartat 3</w:t>
+              <w:t>25 min (A: 30) · apartat 3</w:t>
             </w:r>
           </w:p>
         </w:tc>
@@ -7115,7 +7115,7 @@
                 <w:color w:val="666666"/>
                 <w:sz w:val="17"/>
               </w:rPr>
-              <w:t>15 min (A: 13) · apartat 4</w:t>
+              <w:t>15 min · apartat 4</w:t>
             </w:r>
           </w:p>
         </w:tc>
@@ -7186,7 +7186,7 @@
                 <w:color w:val="1A1A2E"/>
                 <w:sz w:val="18"/>
               </w:rPr>
-              <w:t>Completen la idea del control perdut (A: per què la quimioteràpia fa caure el cabell i dona anèmia).</w:t>
+              <w:t>Completen la idea del control perdut (A: un tumor amb l'índex mitòtic baix que creix sense control: què més, a part de dividir-se de pressa, el fa créixer?).</w:t>
             </w:r>
           </w:p>
         </w:tc>
@@ -7408,7 +7408,7 @@
                 <w:color w:val="1A1A2E"/>
                 <w:sz w:val="18"/>
               </w:rPr>
-              <w:t xml:space="preserve"> la B diu si el fàrmac funciona amb els dos números. La A tria entre eficaç, inútil, tòxic i no concloent, i escriu fins on arriba el veredicte (un ratolí, un camp). La C encercla «ha baixat · és igual · ha pujat» i fa el mètode amb opcions.</w:t>
+              <w:t xml:space="preserve"> la B diu si el fàrmac funciona amb els dos números. La A tria entre eficaç, inútil, tòxic i no concloent, i raona cap a on l'esbiaixaria un error de recompte. La C encercla «ha baixat · és igual · ha pujat» i fa el mètode amb opcions.</w:t>
             </w:r>
           </w:p>
         </w:tc>
@@ -8555,7 +8555,7 @@
                 <w:color w:val="666666"/>
                 <w:sz w:val="17"/>
               </w:rPr>
-              <w:t>20 min · apartat 2</w:t>
+              <w:t>20 min (A: 15) · apartat 2</w:t>
             </w:r>
           </w:p>
         </w:tc>
@@ -8661,7 +8661,7 @@
                 <w:color w:val="1A1A2E"/>
                 <w:sz w:val="18"/>
               </w:rPr>
-              <w:t>Omplen la taula mitosi/meiosi per files (A: dibuixen el mapa sense apunts).</w:t>
+              <w:t>Omplen la taula mitosi/meiosi per files (A: un sol esquema dels tres processos des del mateix cicle, amb una fletxa al pas on fallaria un error de repartiment).</w:t>
             </w:r>
           </w:p>
         </w:tc>
@@ -9136,7 +9136,7 @@
                 <w:color w:val="1A1A2E"/>
                 <w:sz w:val="18"/>
               </w:rPr>
-              <w:t xml:space="preserve"> la B i la C omplen el mapa per files (la C, amb la caixa «Com omplir-la»). La A el dibuixa sense apunts i el compara amb el d'un company.</w:t>
+              <w:t xml:space="preserve"> la B i la C omplen el mapa per files (la C, amb la caixa «Com omplir-la»). La A el dibuixa (o el completa) com un sol esquema dels tres processos des del mateix cicle i hi marca amb una fletxa el pas on fallaria un error de repartiment.</w:t>
             </w:r>
           </w:p>
           <w:p>

</xml_diff>

<commit_message>
Actualitzar la guia docent de SA2 de 4t
Co-Authored-By: Claude Sonnet 5.5 <noreply@anthropic.com>
</commit_message>
<xml_diff>
--- a/public/docs/sa2-guia-docent.docx
+++ b/public/docs/sa2-guia-docent.docx
@@ -59,7 +59,7 @@
           <w:color w:val="666666"/>
           <w:sz w:val="19"/>
         </w:rPr>
-        <w:t>Tota la SA parteix d'una frase d'un informe mèdic: «s'observen cèl·lules que es divideixen sense control». Per entendre-la cal saber com es divideix una cèl·lula normal (S1), per què el cos té dues maneres de dividir-se (S2) i com es mesura amb números que una divisió s'ha descontrolat (S3). La S4 ho ajunta: tres casos, tres processos, i l'alumnat ha de triar quin explica cada un.</w:t>
+        <w:t>Tota la SA parteix d'una frase d'un informe mèdic: «s'observen cèl·lules que es divideixen sense control». Per entendre-la cal saber com es divideix una cèl·lula normal (S1), veure-ho en arrels de ceba reals i entendre per què el cos té dues maneres de dividir-se (S2), i com es mesura amb números que una divisió s'ha descontrolat (S3). La S4 ho ajunta: tres casos, tres processos, i la prova escrita. El producte de la SA és un vídeo del procés i un informe diagnòstic.</w:t>
       </w:r>
     </w:p>
     <w:tbl>
@@ -422,7 +422,7 @@
                 <w:color w:val="1A1A2E"/>
                 <w:sz w:val="18"/>
               </w:rPr>
-              <w:t xml:space="preserve"> El model de plastilina s'ensenya a una altra parella, el veredicte del fàrmac es defensa amb els números, i els exit tiquets es fan presencialment.</w:t>
+              <w:t xml:space="preserve"> El vídeo del procés ensenya el que l'alumnat sap explicar, en el format que triï, el veredicte del fàrmac es defensa amb els números, i els exit tiquets i la prova es fan presencialment i sols.</w:t>
             </w:r>
           </w:p>
         </w:tc>
@@ -1095,7 +1095,7 @@
                 <w:color w:val="1A1A2E"/>
                 <w:sz w:val="18"/>
               </w:rPr>
-              <w:t>Pas «sense meiosi» de l'animació + exit tiquet (1.2) + esquema mitosi/meiosi</w:t>
+              <w:t>Laboratori de la ceba + demostració amb plastilina + exit tiquet (1.2) + deures: el vídeo del procés (peça 1)</w:t>
             </w:r>
           </w:p>
         </w:tc>
@@ -1178,7 +1178,7 @@
                 <w:color w:val="1A1A2E"/>
                 <w:sz w:val="18"/>
               </w:rPr>
-              <w:t>Veredicte defensat amb els números + exit tiquet (3.3) + mini-informe</w:t>
+              <w:t>Biòpsia inicial a classe + seminari amb un cas de mostra + exit tiquet (3.3) + deures: veredicte amb la biòpsia final, taula de tres columnes i vídeo acabat</w:t>
             </w:r>
           </w:p>
         </w:tc>
@@ -1261,7 +1261,7 @@
                 <w:color w:val="1A1A2E"/>
                 <w:sz w:val="18"/>
               </w:rPr>
-              <w:t>Les tres frases reescrites + exit tiquet (1.1) + taula per a la prova</w:t>
+              <w:t>Les tres frases reescrites + prova escrita a la segona hora (sense exit tiquet) + deures: l'informe diagnòstic (peça 2)</w:t>
             </w:r>
           </w:p>
         </w:tc>
@@ -1428,7 +1428,7 @@
                 <w:color w:val="1A1A2E"/>
                 <w:sz w:val="18"/>
               </w:rPr>
-              <w:t>Les 4 sessions</w:t>
+              <w:t>S1, S2 i S3</w:t>
             </w:r>
           </w:p>
         </w:tc>
@@ -1448,7 +1448,7 @@
                 <w:color w:val="1A1A2E"/>
                 <w:sz w:val="18"/>
               </w:rPr>
-              <w:t>S1: la frase de la biòpsia (1.1) · S2: per què dos germans no són iguals (1.2) · S3: un índex que passa del 30 % al 9 % (3.3) · S4: què diferencia mitosi, meiosi i càncer (1.1)</w:t>
+              <w:t>S1: la frase de la biòpsia (1.1) · S2: per què dos germans no són iguals (1.2) · S3: un índex que passa del 30 % al 9 % (3.3). La S4 no en té: la segona hora és la prova</w:t>
             </w:r>
           </w:p>
         </w:tc>
@@ -1614,7 +1614,7 @@
                 <w:color w:val="1A1A2E"/>
                 <w:sz w:val="18"/>
               </w:rPr>
-              <w:t>L'ordre de les fases (S1), els dos models (S2), el veredicte amb els números (S3)</w:t>
+              <w:t>L'ordre de les fases (S1), la preparació de ceba i les fases trobades (S2), el veredicte del cas de mostra amb els números (S3)</w:t>
             </w:r>
           </w:p>
         </w:tc>
@@ -1657,7 +1657,7 @@
                 <w:color w:val="1A1A2E"/>
                 <w:sz w:val="18"/>
               </w:rPr>
-              <w:t>Prova escrita «Ostres de tres jocs» (B i C)</w:t>
+              <w:t>Producte: vídeo del procés (peça 1) + informe diagnòstic (peça 2)</w:t>
             </w:r>
           </w:p>
         </w:tc>
@@ -1677,7 +1677,90 @@
                 <w:color w:val="1A1A2E"/>
                 <w:sz w:val="18"/>
               </w:rPr>
-              <w:t>Després de la S4</w:t>
+              <w:t>S2 → S4</w:t>
+            </w:r>
+          </w:p>
+        </w:tc>
+        <w:tc>
+          <w:tcPr>
+            <w:tcW w:type="dxa" w:w="3855"/>
+          </w:tcPr>
+          <w:p>
+            <w:pPr>
+              <w:spacing w:after="0" w:before="0"/>
+            </w:pPr>
+            <w:r>
+              <w:rPr>
+                <w:rFonts w:ascii="Fira Sans Extra Condensed" w:hAnsi="Fira Sans Extra Condensed" w:cs="Fira Sans Extra Condensed"/>
+                <w:b w:val="0"/>
+                <w:i w:val="0"/>
+                <w:color w:val="1A1A2E"/>
+                <w:sz w:val="18"/>
+              </w:rPr>
+              <w:t>Vídeo de 2–3 minuts (S2, acabat a la S3) i informe final dels casos (a casa, després de la prova de la S4)</w:t>
+            </w:r>
+          </w:p>
+        </w:tc>
+        <w:tc>
+          <w:tcPr>
+            <w:tcW w:type="dxa" w:w="2551"/>
+          </w:tcPr>
+          <w:p>
+            <w:pPr>
+              <w:spacing w:after="0" w:before="0"/>
+            </w:pPr>
+            <w:r>
+              <w:rPr>
+                <w:rFonts w:ascii="Fira Sans Extra Condensed" w:hAnsi="Fira Sans Extra Condensed" w:cs="Fira Sans Extra Condensed"/>
+                <w:b w:val="0"/>
+                <w:i w:val="0"/>
+                <w:color w:val="1A1A2E"/>
+                <w:sz w:val="18"/>
+              </w:rPr>
+              <w:t>Rúbrica del producte</w:t>
+            </w:r>
+          </w:p>
+        </w:tc>
+      </w:tr>
+      <w:tr>
+        <w:tc>
+          <w:tcPr>
+            <w:tcW w:type="dxa" w:w="2381"/>
+            <w:shd w:val="clear" w:fill="F1E9F6"/>
+          </w:tcPr>
+          <w:p>
+            <w:pPr>
+              <w:spacing w:after="0" w:before="0"/>
+            </w:pPr>
+            <w:r>
+              <w:rPr>
+                <w:rFonts w:ascii="Fira Sans Extra Condensed" w:hAnsi="Fira Sans Extra Condensed" w:cs="Fira Sans Extra Condensed"/>
+                <w:b/>
+                <w:i w:val="0"/>
+                <w:color w:val="1A1A2E"/>
+                <w:sz w:val="18"/>
+              </w:rPr>
+              <w:t>Prova escrita «Ostres de tres jocs» (B i C)</w:t>
+            </w:r>
+          </w:p>
+        </w:tc>
+        <w:tc>
+          <w:tcPr>
+            <w:tcW w:type="dxa" w:w="1077"/>
+          </w:tcPr>
+          <w:p>
+            <w:pPr>
+              <w:spacing w:after="0" w:before="0"/>
+            </w:pPr>
+            <w:r>
+              <w:rPr>
+                <w:rFonts w:ascii="Fira Sans Extra Condensed" w:hAnsi="Fira Sans Extra Condensed" w:cs="Fira Sans Extra Condensed"/>
+                <w:b w:val="0"/>
+                <w:i w:val="0"/>
+                <w:color w:val="1A1A2E"/>
+                <w:sz w:val="18"/>
+              </w:rPr>
+              <w:t>S4, segona hora (60 min)</w:t>
             </w:r>
           </w:p>
         </w:tc>
@@ -1775,7 +1858,7 @@
           <w:color w:val="1A1A2E"/>
           <w:sz w:val="18"/>
         </w:rPr>
-        <w:t>Tres versions de cada fitxa. La A no és la B amb menys ajuda: canvia la tasca (triar el criteri d'agrupació abans de veure res, posar hores a cada fase, modelar amb 3 parelles i calcular combinacions, afegir el grup control al veredicte, detectar la trampa d'un número sense comparació).</w:t>
+        <w:t>Tres versions de cada fitxa. La A no és la B amb menys ajuda: canvia la tasca (triar el criteri d'agrupació abans de veure res, posar hores a cada fase, justificar cada pas del protocol de la ceba i raonar què passaria amb 3 parelles de cromosomes, afegir el grup control al veredicte, detectar la trampa d'un número sense comparació).</w:t>
       </w:r>
     </w:p>
     <w:p>
@@ -4086,7 +4169,7 @@
           <w:color w:val="1A1A2E"/>
           <w:sz w:val="18"/>
         </w:rPr>
-        <w:t>Distingir la mitosi (2 cèl·lules idèntiques, material complet) de la meiosi (4 cèl·lules, un de cada parella).</w:t>
+        <w:t>Preparar una tinció d'arrel de ceba seguint el protocol i trobar al microscopi cèl·lules en diferents fases de la mitosi.</w:t>
       </w:r>
     </w:p>
     <w:p>
@@ -4111,7 +4194,32 @@
           <w:color w:val="1A1A2E"/>
           <w:sz w:val="18"/>
         </w:rPr>
-        <w:t>Explicar que els gàmetes tenen la meitat perquè a la fecundació el nombre torni a ser el normal.</w:t>
+        <w:t>Distingir la mitosi (2 cèl·lules idèntiques, material complet) de la meiosi (4 cèl·lules, la meitat) en un esquema.</w:t>
+      </w:r>
+    </w:p>
+    <w:p>
+      <w:pPr>
+        <w:spacing w:before="0" w:after="20"/>
+      </w:pPr>
+      <w:r>
+        <w:rPr>
+          <w:rFonts w:ascii="Fira Sans Extra Condensed" w:hAnsi="Fira Sans Extra Condensed" w:cs="Fira Sans Extra Condensed"/>
+          <w:b/>
+          <w:i w:val="0"/>
+          <w:color w:val="7B3F9E"/>
+          <w:sz w:val="18"/>
+        </w:rPr>
+        <w:t xml:space="preserve">• </w:t>
+      </w:r>
+      <w:r>
+        <w:rPr>
+          <w:rFonts w:ascii="Fira Sans Extra Condensed" w:hAnsi="Fira Sans Extra Condensed" w:cs="Fira Sans Extra Condensed"/>
+          <w:b w:val="0"/>
+          <w:i w:val="0"/>
+          <w:color w:val="1A1A2E"/>
+          <w:sz w:val="18"/>
+        </w:rPr>
+        <w:t>Explicar que els gàmetes tenen la meitat dels cromosomes perquè, en unir-se a la fecundació, el nombre torni a ser el normal.</w:t>
       </w:r>
     </w:p>
     <w:p>
@@ -4161,7 +4269,7 @@
           <w:color w:val="1A1A2E"/>
           <w:sz w:val="18"/>
         </w:rPr>
-        <w:t>Indicar per a què serveix cada divisió: créixer i reparar, o fer gàmetes.</w:t>
+        <w:t>Indicar per a què serveix cada divisió: la mitosi per créixer i reparar, la meiosi per fer gàmetes.</w:t>
       </w:r>
     </w:p>
     <w:tbl>
@@ -4226,7 +4334,7 @@
                 <w:color w:val="1A1A2E"/>
                 <w:sz w:val="18"/>
               </w:rPr>
-              <w:t>Imprimir la fitxa (A/B/C) i l'exit tiquet.</w:t>
+              <w:t>Imprimir la fitxa (A/B/C) i l'exit tiquet (B/A i C).</w:t>
             </w:r>
           </w:p>
           <w:p>
@@ -4251,7 +4359,7 @@
                 <w:color w:val="1A1A2E"/>
                 <w:sz w:val="18"/>
               </w:rPr>
-              <w:t>Preparar el manipulatiu per parella (plantilla a l'annex): plastilina o fils vermells i blaus, de dues mides (B: 2 parelles; A: 3 parelles), i un full DIN A3 amb els requadres MITOSI i MEIOSI.</w:t>
+              <w:t>Material del laboratori per parella: cebes amb arrels ja crescudes, orceïna A i orceïna B amb comptagotes, vidre de rellotge, portaobjectes i cobreobjectes, agulla, paper de filtre, una flama (bec o llum d'alcohol), pinces i microscopi. Bata i guants per a tothom; ulleres, si n'hi ha. Que ningú entri al laboratori amb els cabells solts.</w:t>
             </w:r>
           </w:p>
           <w:p>
@@ -4276,7 +4384,7 @@
                 <w:color w:val="1A1A2E"/>
                 <w:sz w:val="18"/>
               </w:rPr>
-              <w:t>Obrir la Fig.1 (mitosi i meiosi) i deixar carregada l'animació «23 + 23 = 46» de l'apartat 3.</w:t>
+              <w:t>Tenir un microscopi preparat per ensenyar com es fa la foto amb el mòbil a través de l'ocular, i comprovar que el laboratori virtual funciona (/apps/app_lab_ceba.html): és la sortida per a qui no ho aconsegueixi o ha faltat.</w:t>
             </w:r>
           </w:p>
           <w:p>
@@ -4301,7 +4409,32 @@
                 <w:color w:val="1A1A2E"/>
                 <w:sz w:val="18"/>
               </w:rPr>
-              <w:t>Tenir a punt l'app de mitosi i meiosi (/apps/app_mitosi_meiosi.html) per a qui acabi el model.</w:t>
+              <w:t>Per a la demostració de l'apartat 2: plastilina o fils de dos colors (vermell i blau) i dues mides, la Fig.1 (mitosi i meiosi) i l'animació «23 + 23 = 46» carregades. L'alumnat no manipula res a l'apartat 2: això ho explicaran al vídeo, a casa.</w:t>
+            </w:r>
+          </w:p>
+          <w:p>
+            <w:pPr>
+              <w:spacing w:after="20" w:before="0"/>
+            </w:pPr>
+            <w:r>
+              <w:rPr>
+                <w:rFonts w:ascii="Fira Sans Extra Condensed" w:hAnsi="Fira Sans Extra Condensed" w:cs="Fira Sans Extra Condensed"/>
+                <w:b/>
+                <w:i w:val="0"/>
+                <w:color w:val="7B3F9E"/>
+                <w:sz w:val="18"/>
+              </w:rPr>
+              <w:t xml:space="preserve">5 </w:t>
+            </w:r>
+            <w:r>
+              <w:rPr>
+                <w:rFonts w:ascii="Fira Sans Extra Condensed" w:hAnsi="Fira Sans Extra Condensed" w:cs="Fira Sans Extra Condensed"/>
+                <w:b w:val="0"/>
+                <w:i w:val="0"/>
+                <w:color w:val="1A1A2E"/>
+                <w:sz w:val="18"/>
+              </w:rPr>
+              <w:t>Tenir a mà la rúbrica del producte (vídeo del procés + informe diagnòstic) per ensenyar-la en acabar.</w:t>
             </w:r>
           </w:p>
         </w:tc>
@@ -4441,7 +4574,7 @@
                 <w:color w:val="666666"/>
                 <w:sz w:val="17"/>
               </w:rPr>
-              <w:t>10 min (A: 5) · apartat 0</w:t>
+              <w:t>5 min · apartat 0</w:t>
             </w:r>
           </w:p>
         </w:tc>
@@ -4481,7 +4614,7 @@
                 <w:color w:val="1A1A2E"/>
                 <w:sz w:val="18"/>
               </w:rPr>
-              <w:t xml:space="preserve"> teixits que es renoven molt i gairebé no.</w:t>
+              <w:t xml:space="preserve"> un teixit que es renova molt i un que gairebé no.</w:t>
             </w:r>
           </w:p>
           <w:p>
@@ -4506,7 +4639,7 @@
                 <w:color w:val="1A1A2E"/>
                 <w:sz w:val="18"/>
               </w:rPr>
-              <w:t>El problema dels 92:</w:t>
+              <w:t>El problema dels 92, en dues frases:</w:t>
             </w:r>
             <w:r>
               <w:rPr>
@@ -4516,7 +4649,7 @@
                 <w:color w:val="1A1A2E"/>
                 <w:sz w:val="18"/>
               </w:rPr>
-              <w:t xml:space="preserve"> si l'òvul i l'espermatozoide en portessin 46, el fill en tindria 92, i el net 184. On va a parar la meitat?</w:t>
+              <w:t xml:space="preserve"> si l'òvul i l'espermatozoide en portessin 46, el fill en tindria 92. Avui ho veuran en dues etapes: primer, cromosomes de veritat; després, la divisió que els reparteix.</w:t>
             </w:r>
           </w:p>
         </w:tc>
@@ -4585,7 +4718,7 @@
                 <w:color w:val="666666"/>
                 <w:sz w:val="17"/>
               </w:rPr>
-              <w:t>40 min (A: 48) · apartat 1</w:t>
+              <w:t>55 min · apartat 1</w:t>
             </w:r>
           </w:p>
         </w:tc>
@@ -4615,7 +4748,7 @@
                 <w:color w:val="1A1A2E"/>
                 <w:sz w:val="18"/>
               </w:rPr>
-              <w:t>Cèl·lula de partida comuna:</w:t>
+              <w:t>Laboratori real: tinció d'arrel de ceba.</w:t>
             </w:r>
             <w:r>
               <w:rPr>
@@ -4625,7 +4758,7 @@
                 <w:color w:val="1A1A2E"/>
                 <w:sz w:val="18"/>
               </w:rPr>
-              <w:t xml:space="preserve"> B, 2 parelles (una llarga, una curta); A, 3 parelles. Dins cada parella, un vermell (mare) i un blau (pare). «Quants cromosomes hi ha ara?» (4 o 6).</w:t>
+              <w:t xml:space="preserve"> Parelles de laboratori; bata i guants, perquè l'orceïna taca i porta àcid. Repassar el protocol en veu alta (6 passos) i marcar els dos avisos: l'escalfament MAI ha de bullir, i en aixafar no es trenca el cobreobjectes.</w:t>
             </w:r>
           </w:p>
           <w:p>
@@ -4650,7 +4783,7 @@
                 <w:color w:val="1A1A2E"/>
                 <w:sz w:val="18"/>
               </w:rPr>
-              <w:t>Pas comú: copiar.</w:t>
+              <w:t>Escalfament (uns 8 min):</w:t>
             </w:r>
             <w:r>
               <w:rPr>
@@ -4660,7 +4793,7 @@
                 <w:color w:val="1A1A2E"/>
                 <w:sz w:val="18"/>
               </w:rPr>
-              <w:t xml:space="preserve"> Al costat de cada xurro, un d'igual enganxat pel mig: X. Tornar a preguntar: continua havent-hi 4 (o 6).</w:t>
+              <w:t xml:space="preserve"> són minuts morts. Aprofitar-los perquè l'alumnat llegeixi «Com reconeixes cada fase» i comenci la justificació del protocol (A).</w:t>
             </w:r>
           </w:p>
           <w:p>
@@ -4685,7 +4818,7 @@
                 <w:color w:val="1A1A2E"/>
                 <w:sz w:val="18"/>
               </w:rPr>
-              <w:t>Mitosi:</w:t>
+              <w:t>Circular amb una sola pregunta:</w:t>
             </w:r>
             <w:r>
               <w:rPr>
@@ -4695,7 +4828,7 @@
                 <w:color w:val="1A1A2E"/>
                 <w:sz w:val="18"/>
               </w:rPr>
-              <w:t xml:space="preserve"> obrir les X i repartir les còpies en 2 cèl·lules. 4 a cada una, amb les dues mides i els dos colors.</w:t>
+              <w:t xml:space="preserve"> «què veus aquí?». No dir quina fase és. Si no troben cap cèl·lula en divisió, que moguin la preparació cap a la punta de l'arrel; si el camp és ple d'interfase, que provin un altre camp.</w:t>
             </w:r>
           </w:p>
           <w:p>
@@ -4720,7 +4853,7 @@
                 <w:color w:val="1A1A2E"/>
                 <w:sz w:val="18"/>
               </w:rPr>
-              <w:t>Meiosi, des de la mateixa cèl·lula:</w:t>
+              <w:t>Foto i dibuix:</w:t>
             </w:r>
             <w:r>
               <w:rPr>
@@ -4730,7 +4863,7 @@
                 <w:color w:val="1A1A2E"/>
                 <w:sz w:val="18"/>
               </w:rPr>
-              <w:t xml:space="preserve"> divisió 1 = separar les PARELLES (cada X, sencera, a un costat); divisió 2 = separar les CÒPIES. 4 cèl·lules amb 2 cromosomes: un de cada mida.</w:t>
+              <w:t xml:space="preserve"> una cèl·lula de cada fase, fotografiada pel mòbil a través de l'ocular i dibuixada a la fitxa.</w:t>
             </w:r>
           </w:p>
           <w:p>
@@ -4755,7 +4888,7 @@
                 <w:color w:val="1A1A2E"/>
                 <w:sz w:val="18"/>
               </w:rPr>
-              <w:t>Tancar amb la defensa:</w:t>
+              <w:t>Primer índex mitòtic:</w:t>
             </w:r>
             <w:r>
               <w:rPr>
@@ -4765,7 +4898,42 @@
                 <w:color w:val="1A1A2E"/>
                 <w:sz w:val="18"/>
               </w:rPr>
-              <w:t xml:space="preserve"> cada parella ensenya els dos models a una altra i diu quina acaba amb la meitat.</w:t>
+              <w:t xml:space="preserve"> compten un camp (en divisió ÷ total × 100). És un primer tast; la S3 ho farà bé, amb biòpsies.</w:t>
+            </w:r>
+          </w:p>
+          <w:p>
+            <w:pPr>
+              <w:spacing w:after="20" w:before="0"/>
+            </w:pPr>
+            <w:r>
+              <w:rPr>
+                <w:rFonts w:ascii="Fira Sans Extra Condensed" w:hAnsi="Fira Sans Extra Condensed" w:cs="Fira Sans Extra Condensed"/>
+                <w:b/>
+                <w:i w:val="0"/>
+                <w:color w:val="7B3F9E"/>
+                <w:sz w:val="18"/>
+              </w:rPr>
+              <w:t xml:space="preserve">• </w:t>
+            </w:r>
+            <w:r>
+              <w:rPr>
+                <w:rFonts w:ascii="Fira Sans Extra Condensed" w:hAnsi="Fira Sans Extra Condensed" w:cs="Fira Sans Extra Condensed"/>
+                <w:b/>
+                <w:i w:val="0"/>
+                <w:color w:val="1A1A2E"/>
+                <w:sz w:val="18"/>
+              </w:rPr>
+              <w:t>Si una preparació no surt,</w:t>
+            </w:r>
+            <w:r>
+              <w:rPr>
+                <w:rFonts w:ascii="Fira Sans Extra Condensed" w:hAnsi="Fira Sans Extra Condensed" w:cs="Fira Sans Extra Condensed"/>
+                <w:b w:val="0"/>
+                <w:i w:val="0"/>
+                <w:color w:val="1A1A2E"/>
+                <w:sz w:val="18"/>
+              </w:rPr>
+              <w:t xml:space="preserve"> en fan una altra amb una segona punta. Qui encara no ho aconsegueix passa al laboratori virtual.</w:t>
             </w:r>
           </w:p>
         </w:tc>
@@ -4796,7 +4964,7 @@
                 <w:color w:val="1A1A2E"/>
                 <w:sz w:val="18"/>
               </w:rPr>
-              <w:t>Construeixen la cèl·lula, la copien, fan la mitosi i, des de zero, la meiosi.</w:t>
+              <w:t>Preparen la tinció seguint els 6 passos, la miren al microscopi i hi busquen una cèl·lula de cada fase.</w:t>
             </w:r>
           </w:p>
           <w:p>
@@ -4821,7 +4989,32 @@
                 <w:color w:val="1A1A2E"/>
                 <w:sz w:val="18"/>
               </w:rPr>
-              <w:t>Dibuixen els dos resultats i omplen la taula (quants munts, quants cromosomes a cada un).</w:t>
+              <w:t>Fan la foto, dibuixen les cèl·lules i omplen la taula del camp (cèl·lules en divisió, total i índex mitòtic).</w:t>
+            </w:r>
+          </w:p>
+          <w:p>
+            <w:pPr>
+              <w:spacing w:after="20" w:before="0"/>
+            </w:pPr>
+            <w:r>
+              <w:rPr>
+                <w:rFonts w:ascii="Fira Sans Extra Condensed" w:hAnsi="Fira Sans Extra Condensed" w:cs="Fira Sans Extra Condensed"/>
+                <w:b/>
+                <w:i w:val="0"/>
+                <w:color w:val="7B3F9E"/>
+                <w:sz w:val="18"/>
+              </w:rPr>
+              <w:t xml:space="preserve">• </w:t>
+            </w:r>
+            <w:r>
+              <w:rPr>
+                <w:rFonts w:ascii="Fira Sans Extra Condensed" w:hAnsi="Fira Sans Extra Condensed" w:cs="Fira Sans Extra Condensed"/>
+                <w:b w:val="0"/>
+                <w:i w:val="0"/>
+                <w:color w:val="1A1A2E"/>
+                <w:sz w:val="18"/>
+              </w:rPr>
+              <w:t>A: justifiquen tres passos del protocol i valoren si el seu índex és el que esperaven. B: diuen si hi havia més cèl·lules en interfase o en divisió. C: marquen «Fet» a cada pas, dibuixen una cèl·lula que es divideix i una que no, i encerclen.</w:t>
             </w:r>
           </w:p>
         </w:tc>
@@ -4859,7 +5052,7 @@
                 <w:color w:val="666666"/>
                 <w:sz w:val="17"/>
               </w:rPr>
-              <w:t>20 min (A: 22) · apartat 2</w:t>
+              <w:t>25 min · apartat 2</w:t>
             </w:r>
           </w:p>
         </w:tc>
@@ -4889,7 +5082,7 @@
                 <w:color w:val="1A1A2E"/>
                 <w:sz w:val="18"/>
               </w:rPr>
-              <w:t>Fig.1 al projector:</w:t>
+              <w:t>Pont des del laboratori:</w:t>
             </w:r>
             <w:r>
               <w:rPr>
@@ -4899,7 +5092,77 @@
                 <w:color w:val="1A1A2E"/>
                 <w:sz w:val="18"/>
               </w:rPr>
-              <w:t xml:space="preserve"> la mateixa cèl·lula, dues sortides. Llegir la llegenda: color = d'on ve, mida = tipus, X = UN cromosoma.</w:t>
+              <w:t xml:space="preserve"> «tot el que heu vist és mitosi: 2 cèl·lules idèntiques. I la ceba, on farà l'altra divisió?».</w:t>
+            </w:r>
+          </w:p>
+          <w:p>
+            <w:pPr>
+              <w:spacing w:after="20" w:before="0"/>
+            </w:pPr>
+            <w:r>
+              <w:rPr>
+                <w:rFonts w:ascii="Fira Sans Extra Condensed" w:hAnsi="Fira Sans Extra Condensed" w:cs="Fira Sans Extra Condensed"/>
+                <w:b/>
+                <w:i w:val="0"/>
+                <w:color w:val="7B3F9E"/>
+                <w:sz w:val="18"/>
+              </w:rPr>
+              <w:t xml:space="preserve">• </w:t>
+            </w:r>
+            <w:r>
+              <w:rPr>
+                <w:rFonts w:ascii="Fira Sans Extra Condensed" w:hAnsi="Fira Sans Extra Condensed" w:cs="Fira Sans Extra Condensed"/>
+                <w:b/>
+                <w:i w:val="0"/>
+                <w:color w:val="1A1A2E"/>
+                <w:sz w:val="18"/>
+              </w:rPr>
+              <w:t>Demostració amb plastilina o fils (Fig.1 al costat):</w:t>
+            </w:r>
+            <w:r>
+              <w:rPr>
+                <w:rFonts w:ascii="Fira Sans Extra Condensed" w:hAnsi="Fira Sans Extra Condensed" w:cs="Fira Sans Extra Condensed"/>
+                <w:b w:val="0"/>
+                <w:i w:val="0"/>
+                <w:color w:val="1A1A2E"/>
+                <w:sz w:val="18"/>
+              </w:rPr>
+              <w:t xml:space="preserve"> una sola cèl·lula de partida, 2 parelles (vermell = mare, blau = pare; una llarga i una curta). Pas comú: copiar, un xurro igual enganxat pel mig (X). Preguntar: «quants cromosomes hi ha ara?». Continuen sent 4.</w:t>
+            </w:r>
+          </w:p>
+          <w:p>
+            <w:pPr>
+              <w:spacing w:after="20" w:before="0"/>
+            </w:pPr>
+            <w:r>
+              <w:rPr>
+                <w:rFonts w:ascii="Fira Sans Extra Condensed" w:hAnsi="Fira Sans Extra Condensed" w:cs="Fira Sans Extra Condensed"/>
+                <w:b/>
+                <w:i w:val="0"/>
+                <w:color w:val="7B3F9E"/>
+                <w:sz w:val="18"/>
+              </w:rPr>
+              <w:t xml:space="preserve">• </w:t>
+            </w:r>
+            <w:r>
+              <w:rPr>
+                <w:rFonts w:ascii="Fira Sans Extra Condensed" w:hAnsi="Fira Sans Extra Condensed" w:cs="Fira Sans Extra Condensed"/>
+                <w:b/>
+                <w:i w:val="0"/>
+                <w:color w:val="1A1A2E"/>
+                <w:sz w:val="18"/>
+              </w:rPr>
+              <w:t>Primer la mitosi:</w:t>
+            </w:r>
+            <w:r>
+              <w:rPr>
+                <w:rFonts w:ascii="Fira Sans Extra Condensed" w:hAnsi="Fira Sans Extra Condensed" w:cs="Fira Sans Extra Condensed"/>
+                <w:b w:val="0"/>
+                <w:i w:val="0"/>
+                <w:color w:val="1A1A2E"/>
+                <w:sz w:val="18"/>
+              </w:rPr>
+              <w:t xml:space="preserve"> obrir les X i repartir les còpies: 2 cèl·lules idèntiques amb 4 cromosomes. Després la meiosi, des de zero: divisió 1 = separar les PARELLES; divisió 2 = separar les CÒPIES. 4 cèl·lules amb 2 cromosomes, un de cada mida.</w:t>
             </w:r>
           </w:p>
           <w:p>
@@ -4965,7 +5228,32 @@
                 <w:color w:val="1A1A2E"/>
                 <w:sz w:val="18"/>
               </w:rPr>
-              <w:t>Comproven el model amb la figura i omplen la taula de comparació (A: tres espècies i la regla general; C: encercla).</w:t>
+              <w:t>Miren la demostració i la contrasten amb la Fig.1.</w:t>
+            </w:r>
+          </w:p>
+          <w:p>
+            <w:pPr>
+              <w:spacing w:after="20" w:before="0"/>
+            </w:pPr>
+            <w:r>
+              <w:rPr>
+                <w:rFonts w:ascii="Fira Sans Extra Condensed" w:hAnsi="Fira Sans Extra Condensed" w:cs="Fira Sans Extra Condensed"/>
+                <w:b/>
+                <w:i w:val="0"/>
+                <w:color w:val="7B3F9E"/>
+                <w:sz w:val="18"/>
+              </w:rPr>
+              <w:t xml:space="preserve">• </w:t>
+            </w:r>
+            <w:r>
+              <w:rPr>
+                <w:rFonts w:ascii="Fira Sans Extra Condensed" w:hAnsi="Fira Sans Extra Condensed" w:cs="Fira Sans Extra Condensed"/>
+                <w:b w:val="0"/>
+                <w:i w:val="0"/>
+                <w:color w:val="1A1A2E"/>
+                <w:sz w:val="18"/>
+              </w:rPr>
+              <w:t>Omplen la comparació mitosi/meiosi (B: l'exemple humà de 46; A: tres espècies, combinacions possibles i la regla general; C: encerclen MITOSI o MEIOSI).</w:t>
             </w:r>
           </w:p>
         </w:tc>
@@ -5003,7 +5291,7 @@
                 <w:color w:val="666666"/>
                 <w:sz w:val="17"/>
               </w:rPr>
-              <w:t>20 min (A: 18) · apartat 3</w:t>
+              <w:t>15 min · apartat 3</w:t>
             </w:r>
           </w:p>
         </w:tc>
@@ -5033,7 +5321,7 @@
                 <w:color w:val="1A1A2E"/>
                 <w:sz w:val="18"/>
               </w:rPr>
-              <w:t>Projectar l'animació «23 + 23 = 46» ara,</w:t>
+              <w:t>Projectar l'animació «23 + 23 = 46»,</w:t>
             </w:r>
             <w:r>
               <w:rPr>
@@ -5043,7 +5331,7 @@
                 <w:color w:val="1A1A2E"/>
                 <w:sz w:val="18"/>
               </w:rPr>
-              <w:t xml:space="preserve"> a l'inici de l'apartat 3, quan ja han fet la meiosi amb les mans. Avançar pas a pas amb les fletxes; a cada pas, «quants cromosomes hi ha ara?».</w:t>
+              <w:t xml:space="preserve"> pas a pas amb les fletxes. A cada pas, «quants cromosomes hi ha ara?». L'últim pas («sense meiosi») mostra què passaria si els gàmetes en tinguessin 46: 46 → 92 → 184 → 368.</w:t>
             </w:r>
           </w:p>
           <w:p>
@@ -5068,7 +5356,7 @@
                 <w:color w:val="1A1A2E"/>
                 <w:sz w:val="18"/>
               </w:rPr>
-              <w:t>Aturar l'animació abans de l'últim pas</w:t>
+              <w:t>Fig.2:</w:t>
             </w:r>
             <w:r>
               <w:rPr>
@@ -5078,7 +5366,7 @@
                 <w:color w:val="1A1A2E"/>
                 <w:sz w:val="18"/>
               </w:rPr>
-              <w:t xml:space="preserve"> («sense meiosi»): el guardem per tancar la sessió.</w:t>
+              <w:t xml:space="preserve"> òvul (n) + espermatozoide (n) = zigot (2n). Escriure n = la meitat i 2n = el material complet.</w:t>
             </w:r>
           </w:p>
           <w:p>
@@ -5144,7 +5432,32 @@
                 <w:color w:val="1A1A2E"/>
                 <w:sz w:val="18"/>
               </w:rPr>
-              <w:t>Completen «l'òvul en té …, l'espermatozoide …, junts …» i expliquen per què dos germans no són iguals (A: quantes combinacions dona la seva cèl·lula de 3 parelles).</w:t>
+              <w:t>Expliquen per què els gàmetes tenen la meitat i quants cromosomes té un òvul humà (A: primer prediuen què passaria amb 46 + 46; C: completen amb números).</w:t>
+            </w:r>
+          </w:p>
+          <w:p>
+            <w:pPr>
+              <w:spacing w:after="20" w:before="0"/>
+            </w:pPr>
+            <w:r>
+              <w:rPr>
+                <w:rFonts w:ascii="Fira Sans Extra Condensed" w:hAnsi="Fira Sans Extra Condensed" w:cs="Fira Sans Extra Condensed"/>
+                <w:b/>
+                <w:i w:val="0"/>
+                <w:color w:val="7B3F9E"/>
+                <w:sz w:val="18"/>
+              </w:rPr>
+              <w:t xml:space="preserve">• </w:t>
+            </w:r>
+            <w:r>
+              <w:rPr>
+                <w:rFonts w:ascii="Fira Sans Extra Condensed" w:hAnsi="Fira Sans Extra Condensed" w:cs="Fira Sans Extra Condensed"/>
+                <w:b w:val="0"/>
+                <w:i w:val="0"/>
+                <w:color w:val="1A1A2E"/>
+                <w:sz w:val="18"/>
+              </w:rPr>
+              <w:t>Expliquen per què dos germans no són idèntics (C: amb el mètode observo, em pregunto, connecto, dedueixo).</w:t>
             </w:r>
           </w:p>
         </w:tc>
@@ -5182,7 +5495,7 @@
                 <w:color w:val="666666"/>
                 <w:sz w:val="17"/>
               </w:rPr>
-              <w:t>20 min (A: 17) · apartat 4</w:t>
+              <w:t>10 min · apartat 4</w:t>
             </w:r>
           </w:p>
         </w:tc>
@@ -5257,7 +5570,7 @@
                 <w:color w:val="1A1A2E"/>
                 <w:sz w:val="18"/>
               </w:rPr>
-              <w:t xml:space="preserve"> i obrir la pregunta: si una de les dues fallés, què no podries fer?</w:t>
+              <w:t xml:space="preserve"> i demanar-ne la resposta: per què no tens 92 cromosomes? Si una de les dues divisions fallés, què no podries fer?</w:t>
             </w:r>
           </w:p>
         </w:tc>
@@ -5288,7 +5601,7 @@
                 <w:color w:val="1A1A2E"/>
                 <w:sz w:val="18"/>
               </w:rPr>
-              <w:t>Responen on passa cada divisió i per a què (A: per què la quimioteràpia fa caure el cabell).</w:t>
+              <w:t>Omplen la taula on passa cada divisió i per a què (A: per què la quimioteràpia fa caure el cabell i gairebé no toca les neurones; B: responen la pregunta d'entrada en 3-4 línies; C: encerclen quatre casos i completen una frase).</w:t>
             </w:r>
           </w:p>
         </w:tc>
@@ -5356,7 +5669,7 @@
                 <w:color w:val="1A1A2E"/>
                 <w:sz w:val="18"/>
               </w:rPr>
-              <w:t>Tancar amb el pas «sense meiosi» de l'animació:</w:t>
+              <w:t>Exit tiquet imprès:</w:t>
             </w:r>
             <w:r>
               <w:rPr>
@@ -5366,7 +5679,7 @@
                 <w:color w:val="1A1A2E"/>
                 <w:sz w:val="18"/>
               </w:rPr>
-              <w:t xml:space="preserve"> 46 + 46 = 92. És la resposta visual a la pregunta motriu.</w:t>
+              <w:t xml:space="preserve"> per què dos germans no són idèntics (criteri 1.2).</w:t>
             </w:r>
           </w:p>
           <w:p>
@@ -5391,7 +5704,7 @@
                 <w:color w:val="1A1A2E"/>
                 <w:sz w:val="18"/>
               </w:rPr>
-              <w:t>Exit tiquet imprès:</w:t>
+              <w:t>Encarregar el vídeo (peça 1 del producte):</w:t>
             </w:r>
             <w:r>
               <w:rPr>
@@ -5401,7 +5714,7 @@
                 <w:color w:val="1A1A2E"/>
                 <w:sz w:val="18"/>
               </w:rPr>
-              <w:t xml:space="preserve"> per què dos germans no són idèntics (criteri 1.2).</w:t>
+              <w:t xml:space="preserve"> ensenyar la rúbrica. El format és lliure, sense maqueta obligatòria. Ha de mostrar la còpia en forma de X, com acaba cada divisió i per què els gàmetes surten diferents.</w:t>
             </w:r>
           </w:p>
         </w:tc>
@@ -5432,7 +5745,7 @@
                 <w:color w:val="1A1A2E"/>
                 <w:sz w:val="18"/>
               </w:rPr>
-              <w:t>Veuen el pas final i fan l'exit tiquet i la metacognició.</w:t>
+              <w:t>Fan l'exit tiquet i la metacognició.</w:t>
             </w:r>
           </w:p>
         </w:tc>
@@ -5510,7 +5823,7 @@
                 <w:color w:val="1A1A2E"/>
                 <w:sz w:val="18"/>
               </w:rPr>
-              <w:t xml:space="preserve"> la B modela amb 2 parelles. La A amb 3 parelles i fa la meiosi dues vegades, girant alguna parella la segona: compara els gàmetes i calcula quantes combinacions podrien sortir (2³ = 8). La C fa una sola parella de partida i segueix quatre passos escrits; compta munts i cromosomes.</w:t>
+              <w:t xml:space="preserve"> la B segueix el protocol, troba les fases, compta un camp i diu si hi havia més cèl·lules en interfase o en divisió. La A, a més, justifica tres passos (per què només la punta, per què s'escalfa amb àcid, per què s'aixafa) i valora si el seu índex és el que s'esperaria en un teixit que creix, comparant-lo amb el d'una fulla adulta de la mateixa ceba. La C té els 6 passos amb una casella «Fet» a cada un, només dibuixa dues cèl·lules (una que no es divideix i una que sí) i respon encerclant. Compte: la C parla de 3 gotes d'orceïna A en lloc dels 2-3 ml; convé tenir comptagotes.</w:t>
             </w:r>
           </w:p>
           <w:p>
@@ -5545,7 +5858,7 @@
                 <w:color w:val="1A1A2E"/>
                 <w:sz w:val="18"/>
               </w:rPr>
-              <w:t xml:space="preserve"> la B omple la comparació mitosi/meiosi. La A la fa per a tres espècies amb nombres diferents i escriu la regla general. La C encercla MITOSI o MEIOSI en quatre frases.</w:t>
+              <w:t xml:space="preserve"> la B omple la comparació mitosi/meiosi per a una cèl·lula humana de 46 amb l'ajuda del mnemotècnic. La A la fa per a tres espècies (humà 46, gos 78, mosca del vinagre 8), afegeix la columna de combinacions possibles de gàmetes, escriu la regla general amb 2n i n, i té un repte: si la meiosi fa dues divisions, per què el gàmeta acaba amb la meitat i no amb una quarta part. La C encercla MITOSI o MEIOSI en quatre frases.</w:t>
             </w:r>
           </w:p>
           <w:p>
@@ -5580,7 +5893,42 @@
                 <w:color w:val="1A1A2E"/>
                 <w:sz w:val="18"/>
               </w:rPr>
-              <w:t xml:space="preserve"> la B justifica el 23 amb la fecundació. La A, a més, argumenta la variabilitat amb el seu càlcul. La C completa amb números i fa el mètode amb opcions per encerclar.</w:t>
+              <w:t xml:space="preserve"> la B justifica el 23 amb la fecundació. La A comença predient què passaria amb gàmetes de 46 i explica per què l'espècie no ho podria aguantar. La C completa «un òvul té …, un espermatozoide …, junts …» i fa el mètode amb opcions per encerclar.</w:t>
+            </w:r>
+          </w:p>
+          <w:p>
+            <w:pPr>
+              <w:spacing w:after="20" w:before="0"/>
+            </w:pPr>
+            <w:r>
+              <w:rPr>
+                <w:rFonts w:ascii="Fira Sans Extra Condensed" w:hAnsi="Fira Sans Extra Condensed" w:cs="Fira Sans Extra Condensed"/>
+                <w:b/>
+                <w:i w:val="0"/>
+                <w:color w:val="7B3F9E"/>
+                <w:sz w:val="18"/>
+              </w:rPr>
+              <w:t xml:space="preserve">• </w:t>
+            </w:r>
+            <w:r>
+              <w:rPr>
+                <w:rFonts w:ascii="Fira Sans Extra Condensed" w:hAnsi="Fira Sans Extra Condensed" w:cs="Fira Sans Extra Condensed"/>
+                <w:b/>
+                <w:i w:val="0"/>
+                <w:color w:val="1A1A2E"/>
+                <w:sz w:val="18"/>
+              </w:rPr>
+              <w:t>Apartat 4 —</w:t>
+            </w:r>
+            <w:r>
+              <w:rPr>
+                <w:rFonts w:ascii="Fira Sans Extra Condensed" w:hAnsi="Fira Sans Extra Condensed" w:cs="Fira Sans Extra Condensed"/>
+                <w:b w:val="0"/>
+                <w:i w:val="0"/>
+                <w:color w:val="1A1A2E"/>
+                <w:sz w:val="18"/>
+              </w:rPr>
+              <w:t xml:space="preserve"> la B i la A omplen la taula on i per a què, i la B respon la pregunta d'entrada. La A fa servir el repte de la quimioteràpia, amb els dos teixits dels deures. La C encercla quatre casos (la pell que es cura, els testicles, un nen que creix, l'ovari).</w:t>
             </w:r>
           </w:p>
         </w:tc>
@@ -5638,7 +5986,7 @@
                 <w:color w:val="1A1A2E"/>
                 <w:sz w:val="18"/>
               </w:rPr>
-              <w:t>El model de plastilina és un model: no és una cèl·lula, i s'hi pot fer trampa sense adonar-se'n. Val la pena preguntar què NO ensenya (la mida real, el temps, els 46) i per què, tot i així, serveix: perquè obliga a fer cada pas i a comptar. Si el model i la Fig.1 no coincideixen, és el model qui s'ha de revisar.</w:t>
+              <w:t>El laboratori ens ensenya una foto congelada: les cèl·lules estan mortes i aixafades, i la fase de cadascuna és una deducció. A més, l'arrel de ceba només fa mitosi: la meiosi no la veiem mai, la mostrem amb un model o un dibuix. Convé dir-ho: la demostració i el vídeo no són cap cèl·lula; serveixen perquè obliguen a fer cada pas i a comptar. I l'índex mitòtic d'un sol camp pot dependre de quin camp s'ha mirat: la S3 ho recull amb més casos.</w:t>
             </w:r>
           </w:p>
         </w:tc>
@@ -5706,6 +6054,106 @@
                 <w:color w:val="9A3B3B"/>
                 <w:sz w:val="18"/>
               </w:rPr>
+              <w:t>Dir la fase de la cèl·lula abans que l'alumnat la decideixi: ja les coneix de la S1, i el que s'aprèn és a reconèixer-les en una preparació pròpia.</w:t>
+            </w:r>
+          </w:p>
+          <w:p>
+            <w:pPr>
+              <w:spacing w:after="20" w:before="0"/>
+            </w:pPr>
+            <w:r>
+              <w:rPr>
+                <w:rFonts w:ascii="Fira Sans Extra Condensed" w:hAnsi="Fira Sans Extra Condensed" w:cs="Fira Sans Extra Condensed"/>
+                <w:b/>
+                <w:i w:val="0"/>
+                <w:color w:val="9A3B3B"/>
+                <w:sz w:val="18"/>
+              </w:rPr>
+              <w:t xml:space="preserve">• </w:t>
+            </w:r>
+            <w:r>
+              <w:rPr>
+                <w:rFonts w:ascii="Fira Sans Extra Condensed" w:hAnsi="Fira Sans Extra Condensed" w:cs="Fira Sans Extra Condensed"/>
+                <w:b w:val="0"/>
+                <w:i w:val="0"/>
+                <w:color w:val="9A3B3B"/>
+                <w:sz w:val="18"/>
+              </w:rPr>
+              <w:t>Deixar que l'orceïna bulli o que s'escalfi sense control: MAI ha de bullir. Compte amb la flama i amb l'àcid; bata i guants.</w:t>
+            </w:r>
+          </w:p>
+          <w:p>
+            <w:pPr>
+              <w:spacing w:after="20" w:before="0"/>
+            </w:pPr>
+            <w:r>
+              <w:rPr>
+                <w:rFonts w:ascii="Fira Sans Extra Condensed" w:hAnsi="Fira Sans Extra Condensed" w:cs="Fira Sans Extra Condensed"/>
+                <w:b/>
+                <w:i w:val="0"/>
+                <w:color w:val="9A3B3B"/>
+                <w:sz w:val="18"/>
+              </w:rPr>
+              <w:t xml:space="preserve">• </w:t>
+            </w:r>
+            <w:r>
+              <w:rPr>
+                <w:rFonts w:ascii="Fira Sans Extra Condensed" w:hAnsi="Fira Sans Extra Condensed" w:cs="Fira Sans Extra Condensed"/>
+                <w:b w:val="0"/>
+                <w:i w:val="0"/>
+                <w:color w:val="9A3B3B"/>
+                <w:sz w:val="18"/>
+              </w:rPr>
+              <w:t>Allargar la teoria dins del laboratori: són 55 minuts de feina de mans. L'explicació va a l'apartat 2.</w:t>
+            </w:r>
+          </w:p>
+          <w:p>
+            <w:pPr>
+              <w:spacing w:after="20" w:before="0"/>
+            </w:pPr>
+            <w:r>
+              <w:rPr>
+                <w:rFonts w:ascii="Fira Sans Extra Condensed" w:hAnsi="Fira Sans Extra Condensed" w:cs="Fira Sans Extra Condensed"/>
+                <w:b/>
+                <w:i w:val="0"/>
+                <w:color w:val="9A3B3B"/>
+                <w:sz w:val="18"/>
+              </w:rPr>
+              <w:t xml:space="preserve">• </w:t>
+            </w:r>
+            <w:r>
+              <w:rPr>
+                <w:rFonts w:ascii="Fira Sans Extra Condensed" w:hAnsi="Fira Sans Extra Condensed" w:cs="Fira Sans Extra Condensed"/>
+                <w:b w:val="0"/>
+                <w:i w:val="0"/>
+                <w:color w:val="9A3B3B"/>
+                <w:sz w:val="18"/>
+              </w:rPr>
+              <w:t>Dir que al microscopi s'ha vist meiosi: a l'arrel de ceba només es veu mitosi.</w:t>
+            </w:r>
+          </w:p>
+          <w:p>
+            <w:pPr>
+              <w:spacing w:after="20" w:before="0"/>
+            </w:pPr>
+            <w:r>
+              <w:rPr>
+                <w:rFonts w:ascii="Fira Sans Extra Condensed" w:hAnsi="Fira Sans Extra Condensed" w:cs="Fira Sans Extra Condensed"/>
+                <w:b/>
+                <w:i w:val="0"/>
+                <w:color w:val="9A3B3B"/>
+                <w:sz w:val="18"/>
+              </w:rPr>
+              <w:t xml:space="preserve">• </w:t>
+            </w:r>
+            <w:r>
+              <w:rPr>
+                <w:rFonts w:ascii="Fira Sans Extra Condensed" w:hAnsi="Fira Sans Extra Condensed" w:cs="Fira Sans Extra Condensed"/>
+                <w:b w:val="0"/>
+                <w:i w:val="0"/>
+                <w:color w:val="9A3B3B"/>
+                <w:sz w:val="18"/>
+              </w:rPr>
               <w:t>Dir «la meitat» sense «un de cada parella». Un gàmeta amb dos cromosomes llargs també té «la meitat», i és un error.</w:t>
             </w:r>
           </w:p>
@@ -5731,7 +6179,7 @@
                 <w:color w:val="9A3B3B"/>
                 <w:sz w:val="18"/>
               </w:rPr>
-              <w:t>Comptar les cromàtides com a cromosomes: una X és un cromosoma, a la plastilina i a l'animació.</w:t>
+              <w:t>Comptar les dues còpies d'una X com a dos cromosomes: una X és UN cromosoma copiat, a la demostració i a l'animació.</w:t>
             </w:r>
           </w:p>
           <w:p>
@@ -5757,56 +6205,6 @@
                 <w:sz w:val="18"/>
               </w:rPr>
               <w:t>Introduir el sobrecreuament (crossing-over) a la B o la C. Només com a ampliació de la A, si acaba abans.</w:t>
-            </w:r>
-          </w:p>
-          <w:p>
-            <w:pPr>
-              <w:spacing w:after="20" w:before="0"/>
-            </w:pPr>
-            <w:r>
-              <w:rPr>
-                <w:rFonts w:ascii="Fira Sans Extra Condensed" w:hAnsi="Fira Sans Extra Condensed" w:cs="Fira Sans Extra Condensed"/>
-                <w:b/>
-                <w:i w:val="0"/>
-                <w:color w:val="9A3B3B"/>
-                <w:sz w:val="18"/>
-              </w:rPr>
-              <w:t xml:space="preserve">• </w:t>
-            </w:r>
-            <w:r>
-              <w:rPr>
-                <w:rFonts w:ascii="Fira Sans Extra Condensed" w:hAnsi="Fira Sans Extra Condensed" w:cs="Fira Sans Extra Condensed"/>
-                <w:b w:val="0"/>
-                <w:i w:val="0"/>
-                <w:color w:val="9A3B3B"/>
-                <w:sz w:val="18"/>
-              </w:rPr>
-              <w:t>Projectar l'animació abans del manipulatiu: la gràcia és que l'alumnat hi arribi amb les mans.</w:t>
-            </w:r>
-          </w:p>
-          <w:p>
-            <w:pPr>
-              <w:spacing w:after="20" w:before="0"/>
-            </w:pPr>
-            <w:r>
-              <w:rPr>
-                <w:rFonts w:ascii="Fira Sans Extra Condensed" w:hAnsi="Fira Sans Extra Condensed" w:cs="Fira Sans Extra Condensed"/>
-                <w:b/>
-                <w:i w:val="0"/>
-                <w:color w:val="9A3B3B"/>
-                <w:sz w:val="18"/>
-              </w:rPr>
-              <w:t xml:space="preserve">• </w:t>
-            </w:r>
-            <w:r>
-              <w:rPr>
-                <w:rFonts w:ascii="Fira Sans Extra Condensed" w:hAnsi="Fira Sans Extra Condensed" w:cs="Fira Sans Extra Condensed"/>
-                <w:b w:val="0"/>
-                <w:i w:val="0"/>
-                <w:color w:val="9A3B3B"/>
-                <w:sz w:val="18"/>
-              </w:rPr>
-              <w:t>Ensenyar el pas «sense meiosi» a meitat de sessió: tanca la sessió.</w:t>
             </w:r>
           </w:p>
         </w:tc>
@@ -5938,7 +6336,7 @@
                 <w:color w:val="1A1A2E"/>
                 <w:sz w:val="18"/>
               </w:rPr>
-              <w:t>Manipulatiu per parella: plastilina o fils vermells i blaus de 2 (B) o 3 (A) mides, i full A3.</w:t>
+              <w:t>Laboratori per parella: cebes amb arrels, orceïna A i B, material de vidre, paper de filtre, flama, microscopi, mòbil, bata i guants.</w:t>
             </w:r>
           </w:p>
           <w:p>
@@ -5963,6 +6361,56 @@
                 <w:color w:val="1A1A2E"/>
                 <w:sz w:val="18"/>
               </w:rPr>
+              <w:t>Laboratori virtual (app_lab_ceba.html), per a qui no hi és o no li surt la preparació.</w:t>
+            </w:r>
+          </w:p>
+          <w:p>
+            <w:pPr>
+              <w:spacing w:after="20" w:before="0"/>
+            </w:pPr>
+            <w:r>
+              <w:rPr>
+                <w:rFonts w:ascii="Fira Sans Extra Condensed" w:hAnsi="Fira Sans Extra Condensed" w:cs="Fira Sans Extra Condensed"/>
+                <w:b/>
+                <w:i w:val="0"/>
+                <w:color w:val="7B3F9E"/>
+                <w:sz w:val="18"/>
+              </w:rPr>
+              <w:t xml:space="preserve">• </w:t>
+            </w:r>
+            <w:r>
+              <w:rPr>
+                <w:rFonts w:ascii="Fira Sans Extra Condensed" w:hAnsi="Fira Sans Extra Condensed" w:cs="Fira Sans Extra Condensed"/>
+                <w:b w:val="0"/>
+                <w:i w:val="0"/>
+                <w:color w:val="1A1A2E"/>
+                <w:sz w:val="18"/>
+              </w:rPr>
+              <w:t>Plastilina o fils de dos colors i dues mides, per a la demostració del docent.</w:t>
+            </w:r>
+          </w:p>
+          <w:p>
+            <w:pPr>
+              <w:spacing w:after="20" w:before="0"/>
+            </w:pPr>
+            <w:r>
+              <w:rPr>
+                <w:rFonts w:ascii="Fira Sans Extra Condensed" w:hAnsi="Fira Sans Extra Condensed" w:cs="Fira Sans Extra Condensed"/>
+                <w:b/>
+                <w:i w:val="0"/>
+                <w:color w:val="7B3F9E"/>
+                <w:sz w:val="18"/>
+              </w:rPr>
+              <w:t xml:space="preserve">• </w:t>
+            </w:r>
+            <w:r>
+              <w:rPr>
+                <w:rFonts w:ascii="Fira Sans Extra Condensed" w:hAnsi="Fira Sans Extra Condensed" w:cs="Fira Sans Extra Condensed"/>
+                <w:b w:val="0"/>
+                <w:i w:val="0"/>
+                <w:color w:val="1A1A2E"/>
+                <w:sz w:val="18"/>
+              </w:rPr>
               <w:t>Fig.1 (mitosi i meiosi), Fig.2 (fecundació) i animació «23 + 23 = 46».</w:t>
             </w:r>
           </w:p>
@@ -5988,7 +6436,32 @@
                 <w:color w:val="1A1A2E"/>
                 <w:sz w:val="18"/>
               </w:rPr>
-              <w:t>App de mitosi i meiosi, per comprovar el model.</w:t>
+              <w:t>App de mitosi i meiosi, per repassar i per preparar el vídeo.</w:t>
+            </w:r>
+          </w:p>
+          <w:p>
+            <w:pPr>
+              <w:spacing w:after="20" w:before="0"/>
+            </w:pPr>
+            <w:r>
+              <w:rPr>
+                <w:rFonts w:ascii="Fira Sans Extra Condensed" w:hAnsi="Fira Sans Extra Condensed" w:cs="Fira Sans Extra Condensed"/>
+                <w:b/>
+                <w:i w:val="0"/>
+                <w:color w:val="7B3F9E"/>
+                <w:sz w:val="18"/>
+              </w:rPr>
+              <w:t xml:space="preserve">• </w:t>
+            </w:r>
+            <w:r>
+              <w:rPr>
+                <w:rFonts w:ascii="Fira Sans Extra Condensed" w:hAnsi="Fira Sans Extra Condensed" w:cs="Fira Sans Extra Condensed"/>
+                <w:b w:val="0"/>
+                <w:i w:val="0"/>
+                <w:color w:val="1A1A2E"/>
+                <w:sz w:val="18"/>
+              </w:rPr>
+              <w:t>Rúbrica del producte (vídeo del procés + informe diagnòstic).</w:t>
             </w:r>
           </w:p>
         </w:tc>
@@ -6018,7 +6491,32 @@
                 <w:color w:val="1A1A2E"/>
                 <w:sz w:val="18"/>
               </w:rPr>
-              <w:t>Esquema-resum d'una cara comparant mitosi i meiosi: nombre de divisions, cèl·lules filles, material genètic i per a què serveix, amb una frase pròpia.</w:t>
+              <w:t>Peça 1 del producte: vídeo de 2-3 minuts que explica la mitosi i la meiosi. No cal cap maqueta: el format és lliure (dibuixos o paper retallat, pissarra, animació, l'app, plastilina…). Això sí, han de seguir la MATEIXA cèl·lula de partida de principi a fi (2 parelles: un cromosoma vermell = mare i un blau = pare a cada parella).</w:t>
+            </w:r>
+          </w:p>
+          <w:p>
+            <w:pPr>
+              <w:spacing w:after="20" w:before="0"/>
+            </w:pPr>
+            <w:r>
+              <w:rPr>
+                <w:rFonts w:ascii="Fira Sans Extra Condensed" w:hAnsi="Fira Sans Extra Condensed" w:cs="Fira Sans Extra Condensed"/>
+                <w:b/>
+                <w:i w:val="0"/>
+                <w:color w:val="7B3F9E"/>
+                <w:sz w:val="18"/>
+              </w:rPr>
+              <w:t xml:space="preserve">2 </w:t>
+            </w:r>
+            <w:r>
+              <w:rPr>
+                <w:rFonts w:ascii="Fira Sans Extra Condensed" w:hAnsi="Fira Sans Extra Condensed" w:cs="Fira Sans Extra Condensed"/>
+                <w:b w:val="0"/>
+                <w:i w:val="0"/>
+                <w:color w:val="1A1A2E"/>
+                <w:sz w:val="18"/>
+              </w:rPr>
+              <w:t>Al vídeo ha de quedar clar el pas de còpia (forma de X), com acaba cada divisió (quantes cèl·lules i quants cromosomes) i per què els gàmetes surten diferents. Es mira la rúbrica abans de gravar, s'acaba a la S3 i es lliura a la S4.</w:t>
             </w:r>
           </w:p>
         </w:tc>
@@ -6046,7 +6544,7 @@
           <w:color w:val="666666"/>
           <w:sz w:val="18"/>
         </w:rPr>
-        <w:t>La S3 torna a la mitosi, ara per mesurar-la: si un tumor és mitosi sense fre, es pot comptar.</w:t>
+        <w:t>La S3 comença recordant el laboratori de la ceba (quantes cèl·lules en divisió van trobar) i converteix aquell primer recompte en una eina de diagnòstic: l'índex mitòtic, ara amb biòpsies de pacients. El vídeo avança a casa.</w:t>
       </w:r>
     </w:p>
     <w:p>
@@ -6324,7 +6822,7 @@
                 <w:color w:val="1A1A2E"/>
                 <w:sz w:val="18"/>
               </w:rPr>
-              <w:t>Imprimir la fitxa (A/B/C), l'exit tiquet i una fitxa de pacient diferent per equip (carpeta S3-index-mitotic/biopsies-pacients).</w:t>
+              <w:t>Imprimir la fitxa (A/B/C), l'exit tiquet i una fitxa de pacient diferent per equip (carpeta S3-index-mitotic/biopsies-pacients). Cada fitxa porta la biòpsia inicial i la final, però a classe només es compta la inicial: la final es treu a casa.</w:t>
             </w:r>
           </w:p>
           <w:p>
@@ -6374,7 +6872,7 @@
                 <w:color w:val="1A1A2E"/>
                 <w:sz w:val="18"/>
               </w:rPr>
-              <w:t>Preparar a la pissarra la taula de la posada en comú: fàrmac · dosi · temps · índex abans · índex després · veredicte.</w:t>
+              <w:t>Preparar a la pissarra el cas de mostra del seminari (un ratolí que passa del 24 % al 22 %; a la A, amb el control del 24 % al 23 %) i la taula de la posada en comú: fàrmac · dosi · temps · índex abans · veredicte.</w:t>
             </w:r>
           </w:p>
           <w:p>
@@ -6400,6 +6898,31 @@
                 <w:sz w:val="18"/>
               </w:rPr>
               <w:t>Obrir la Fig.1 (esquema i foto real de cada fase) i la Fig.2 (exemple de fitxa de pacient).</w:t>
+            </w:r>
+          </w:p>
+          <w:p>
+            <w:pPr>
+              <w:spacing w:after="20" w:before="0"/>
+            </w:pPr>
+            <w:r>
+              <w:rPr>
+                <w:rFonts w:ascii="Fira Sans Extra Condensed" w:hAnsi="Fira Sans Extra Condensed" w:cs="Fira Sans Extra Condensed"/>
+                <w:b/>
+                <w:i w:val="0"/>
+                <w:color w:val="7B3F9E"/>
+                <w:sz w:val="18"/>
+              </w:rPr>
+              <w:t xml:space="preserve">5 </w:t>
+            </w:r>
+            <w:r>
+              <w:rPr>
+                <w:rFonts w:ascii="Fira Sans Extra Condensed" w:hAnsi="Fira Sans Extra Condensed" w:cs="Fira Sans Extra Condensed"/>
+                <w:b w:val="0"/>
+                <w:i w:val="0"/>
+                <w:color w:val="1A1A2E"/>
+                <w:sz w:val="18"/>
+              </w:rPr>
+              <w:t>Tenir present el laboratori de la ceba de la S2: l'alumnat el recordarà a l'inici, i el primer índex que van calcular allà és el punt de partida.</w:t>
             </w:r>
           </w:p>
         </w:tc>
@@ -6569,7 +7092,7 @@
                 <w:color w:val="1A1A2E"/>
                 <w:sz w:val="18"/>
               </w:rPr>
-              <w:t>Posada en comú dels deures:</w:t>
+              <w:t>Recordar el laboratori de la S2:</w:t>
             </w:r>
             <w:r>
               <w:rPr>
@@ -6579,7 +7102,7 @@
                 <w:color w:val="1A1A2E"/>
                 <w:sz w:val="18"/>
               </w:rPr>
-              <w:t xml:space="preserve"> l'esquema mitosi/meiosi.</w:t>
+              <w:t xml:space="preserve"> a l'arrel de ceba, hi havia més cèl·lules en divisió o en interfase? Per què a la punta de l'arrel n'hi havia tantes en divisió? Cada parella diu el seu índex d'aquell dia.</w:t>
             </w:r>
           </w:p>
           <w:p>
@@ -6614,7 +7137,7 @@
                 <w:color w:val="1A1A2E"/>
                 <w:sz w:val="18"/>
               </w:rPr>
-              <w:t xml:space="preserve"> com ho sap un laboratori, sense obrir el ratolí, si el fàrmac frena el tumor?</w:t>
+              <w:t xml:space="preserve"> un patòleg mira teixits al microscopi per saber si hi ha càncer. Què busca? Com ho sap un laboratori, sense obrir el ratolí, si el fàrmac frena el tumor?</w:t>
             </w:r>
           </w:p>
         </w:tc>
@@ -6645,7 +7168,7 @@
                 <w:color w:val="1A1A2E"/>
                 <w:sz w:val="18"/>
               </w:rPr>
-              <w:t>Escriuen què creuen que busca un patòleg al microscopi.</w:t>
+              <w:t>Escriuen què van veure a la ceba i què creuen que busca un patòleg al microscopi.</w:t>
             </w:r>
           </w:p>
         </w:tc>
@@ -6683,7 +7206,7 @@
                 <w:color w:val="666666"/>
                 <w:sz w:val="17"/>
               </w:rPr>
-              <w:t>40 min (A: 45) · apartat 1</w:t>
+              <w:t>35 min (A: 40) · apartat 1</w:t>
             </w:r>
           </w:p>
         </w:tc>
@@ -6759,6 +7282,41 @@
                 <w:sz w:val="18"/>
               </w:rPr>
               <w:t xml:space="preserve"> 50 cèl·lules, 10 en divisió → 20 %.</w:t>
+            </w:r>
+          </w:p>
+          <w:p>
+            <w:pPr>
+              <w:spacing w:after="20" w:before="0"/>
+            </w:pPr>
+            <w:r>
+              <w:rPr>
+                <w:rFonts w:ascii="Fira Sans Extra Condensed" w:hAnsi="Fira Sans Extra Condensed" w:cs="Fira Sans Extra Condensed"/>
+                <w:b/>
+                <w:i w:val="0"/>
+                <w:color w:val="7B3F9E"/>
+                <w:sz w:val="18"/>
+              </w:rPr>
+              <w:t xml:space="preserve">• </w:t>
+            </w:r>
+            <w:r>
+              <w:rPr>
+                <w:rFonts w:ascii="Fira Sans Extra Condensed" w:hAnsi="Fira Sans Extra Condensed" w:cs="Fira Sans Extra Condensed"/>
+                <w:b/>
+                <w:i w:val="0"/>
+                <w:color w:val="1A1A2E"/>
+                <w:sz w:val="18"/>
+              </w:rPr>
+              <w:t>Avui només la biòpsia INICIAL.</w:t>
+            </w:r>
+            <w:r>
+              <w:rPr>
+                <w:rFonts w:ascii="Fira Sans Extra Condensed" w:hAnsi="Fira Sans Extra Condensed" w:cs="Fira Sans Extra Condensed"/>
+                <w:b w:val="0"/>
+                <w:i w:val="0"/>
+                <w:color w:val="1A1A2E"/>
+                <w:sz w:val="18"/>
+              </w:rPr>
+              <w:t xml:space="preserve"> La final la compten a casa, igual. Cal que s'apuntin bé el número d'avui, perquè el necessitaran per al veredicte.</w:t>
             </w:r>
           </w:p>
           <w:p>
@@ -6824,7 +7382,7 @@
                 <w:color w:val="1A1A2E"/>
                 <w:sz w:val="18"/>
               </w:rPr>
-              <w:t>Compten el total i les cèl·lules en divisió a les dues biòpsies i calculen els dos índexs (A: amb la columna del control; C: taula guiada pas a pas).</w:t>
+              <w:t>Compten el total i les cèl·lules en divisió a la biòpsia inicial i en calculen l'índex mitòtic (A: reparteixen les cèl·lules en divisió entre les quatre fases i demanen la columna del control a la posada en comú; C: calculadora amb exemple fet i taula guiada).</w:t>
             </w:r>
           </w:p>
         </w:tc>
@@ -6902,7 +7460,7 @@
                 <w:color w:val="1A1A2E"/>
                 <w:sz w:val="18"/>
               </w:rPr>
-              <w:t xml:space="preserve"> i la trampa: el llindar depèn del teixit. La pell i l'intestí tenen l'índex alt de manera sana; el múscul i el sistema nerviós, gairebé zero.</w:t>
+              <w:t xml:space="preserve"> i la trampa: el llindar depèn del teixit. La pell, l'intestí i la medul·la dels ossos tenen l'índex alt de manera sana; el múscul i el sistema nerviós, gairebé zero.</w:t>
             </w:r>
           </w:p>
         </w:tc>
@@ -6933,7 +7491,7 @@
                 <w:color w:val="1A1A2E"/>
                 <w:sz w:val="18"/>
               </w:rPr>
-              <w:t>Interpreten els seus números (A: quina dada demanarien abans de dir que una biòpsia és sospitosa).</w:t>
+              <w:t>Interpreten el seu número (A: quina dada demanarien abans de dir que una biòpsia és sospitosa; C: encerclen ha baixat · és igual · ha pujat).</w:t>
             </w:r>
           </w:p>
         </w:tc>
@@ -6971,7 +7529,7 @@
                 <w:color w:val="666666"/>
                 <w:sz w:val="17"/>
               </w:rPr>
-              <w:t>25 min (A: 30) · apartat 3</w:t>
+              <w:t>30 min (A: 35) · apartat 3</w:t>
             </w:r>
           </w:p>
         </w:tc>
@@ -7001,7 +7559,7 @@
                 <w:color w:val="1A1A2E"/>
                 <w:sz w:val="18"/>
               </w:rPr>
-              <w:t>Seminari de laboratori:</w:t>
+              <w:t>Seminari: practiquem el veredicte amb un cas de mostra,</w:t>
             </w:r>
             <w:r>
               <w:rPr>
@@ -7011,7 +7569,7 @@
                 <w:color w:val="1A1A2E"/>
                 <w:sz w:val="18"/>
               </w:rPr>
-              <w:t xml:space="preserve"> cada equip escriu els seus números a la taula de la pissarra i dona el veredicte.</w:t>
+              <w:t xml:space="preserve"> tots junts, a la pissarra: un ratolí que passa del 24 % al 22 %. Funciona el fàrmac? Amb quins números? A la A, amb el control (24 % → 23 %) i els quatre veredictes.</w:t>
             </w:r>
           </w:p>
           <w:p>
@@ -7047,6 +7605,41 @@
                 <w:sz w:val="18"/>
               </w:rPr>
               <w:t xml:space="preserve"> «funciona perquè ha passat del … al …».</w:t>
+            </w:r>
+          </w:p>
+          <w:p>
+            <w:pPr>
+              <w:spacing w:after="20" w:before="0"/>
+            </w:pPr>
+            <w:r>
+              <w:rPr>
+                <w:rFonts w:ascii="Fira Sans Extra Condensed" w:hAnsi="Fira Sans Extra Condensed" w:cs="Fira Sans Extra Condensed"/>
+                <w:b/>
+                <w:i w:val="0"/>
+                <w:color w:val="7B3F9E"/>
+                <w:sz w:val="18"/>
+              </w:rPr>
+              <w:t xml:space="preserve">• </w:t>
+            </w:r>
+            <w:r>
+              <w:rPr>
+                <w:rFonts w:ascii="Fira Sans Extra Condensed" w:hAnsi="Fira Sans Extra Condensed" w:cs="Fira Sans Extra Condensed"/>
+                <w:b/>
+                <w:i w:val="0"/>
+                <w:color w:val="1A1A2E"/>
+                <w:sz w:val="18"/>
+              </w:rPr>
+              <w:t>Deixar clar que el seu veredicte el fan a casa,</w:t>
+            </w:r>
+            <w:r>
+              <w:rPr>
+                <w:rFonts w:ascii="Fira Sans Extra Condensed" w:hAnsi="Fira Sans Extra Condensed" w:cs="Fira Sans Extra Condensed"/>
+                <w:b w:val="0"/>
+                <w:i w:val="0"/>
+                <w:color w:val="1A1A2E"/>
+                <w:sz w:val="18"/>
+              </w:rPr>
+              <w:t xml:space="preserve"> amb la biòpsia final, igual que acaben de practicar.</w:t>
             </w:r>
           </w:p>
         </w:tc>
@@ -7077,7 +7670,7 @@
                 <w:color w:val="1A1A2E"/>
                 <w:sz w:val="18"/>
               </w:rPr>
-              <w:t>Decideixen el veredicte i el defensen davant la classe (A: eficaç · inútil · tòxic · no concloent, amb els límits de la mesura).</w:t>
+              <w:t>Resolen el cas de mostra amb el mètode (C: observo, em pregunto, connecto, dedueixo) i escriuen el veredicte amb els números (A: eficaç · inútil · tòxic · no concloent, i què els faltaria per concloure).</w:t>
             </w:r>
           </w:p>
         </w:tc>
@@ -7155,7 +7748,7 @@
                 <w:color w:val="1A1A2E"/>
                 <w:sz w:val="18"/>
               </w:rPr>
-              <w:t xml:space="preserve"> per què el càncer no para, i què fa un fàrmac antimitòtic.</w:t>
+              <w:t xml:space="preserve"> per què el càncer no para, i què fa un fàrmac antimitòtic. I per què la quimioteràpia té efectes secundaris.</w:t>
             </w:r>
           </w:p>
         </w:tc>
@@ -7186,7 +7779,7 @@
                 <w:color w:val="1A1A2E"/>
                 <w:sz w:val="18"/>
               </w:rPr>
-              <w:t>Completen la idea del control perdut (A: un tumor amb l'índex mitòtic baix que creix sense control: què més, a part de dividir-se de pressa, el fa créixer?).</w:t>
+              <w:t>Completen la idea del control perdut (A: un tumor amb l'índex mitòtic baix que creix sense control: què més, a part de dividir-se de pressa, el fa créixer?; C: encerclen i completen «Compta quantes cèl·lules… i després…»).</w:t>
             </w:r>
           </w:p>
         </w:tc>
@@ -7265,6 +7858,41 @@
                 <w:sz w:val="18"/>
               </w:rPr>
               <w:t xml:space="preserve"> un altre ratolí passa del 30 % al 9 %. Funciona? (criteri 3.3).</w:t>
+            </w:r>
+          </w:p>
+          <w:p>
+            <w:pPr>
+              <w:spacing w:after="20" w:before="0"/>
+            </w:pPr>
+            <w:r>
+              <w:rPr>
+                <w:rFonts w:ascii="Fira Sans Extra Condensed" w:hAnsi="Fira Sans Extra Condensed" w:cs="Fira Sans Extra Condensed"/>
+                <w:b/>
+                <w:i w:val="0"/>
+                <w:color w:val="7B3F9E"/>
+                <w:sz w:val="18"/>
+              </w:rPr>
+              <w:t xml:space="preserve">• </w:t>
+            </w:r>
+            <w:r>
+              <w:rPr>
+                <w:rFonts w:ascii="Fira Sans Extra Condensed" w:hAnsi="Fira Sans Extra Condensed" w:cs="Fira Sans Extra Condensed"/>
+                <w:b/>
+                <w:i w:val="0"/>
+                <w:color w:val="1A1A2E"/>
+                <w:sz w:val="18"/>
+              </w:rPr>
+              <w:t>Recordar els deures,</w:t>
+            </w:r>
+            <w:r>
+              <w:rPr>
+                <w:rFonts w:ascii="Fira Sans Extra Condensed" w:hAnsi="Fira Sans Extra Condensed" w:cs="Fira Sans Extra Condensed"/>
+                <w:b w:val="0"/>
+                <w:i w:val="0"/>
+                <w:color w:val="1A1A2E"/>
+                <w:sz w:val="18"/>
+              </w:rPr>
+              <w:t xml:space="preserve"> que són tres: acabar el cas, la taula de tres columnes i acabar el vídeo.</w:t>
             </w:r>
           </w:p>
         </w:tc>
@@ -7373,7 +8001,7 @@
                 <w:color w:val="1A1A2E"/>
                 <w:sz w:val="18"/>
               </w:rPr>
-              <w:t xml:space="preserve"> la B calcula l'índex abans i després. La A té una columna més: el control (un ratolí sense fàrmac), que recull a la posada en comú; si a l'aula no n'hi ha cap, ho ha d'anotar. La C té la calculadora, un exemple fet i una taula que s'omple de dalt a baix.</w:t>
+              <w:t xml:space="preserve"> la B calcula l'índex de la biòpsia inicial. La A té més columnes: la biòpsia final (a casa) i el control (un ratolí sense fàrmac), que recull a la posada en comú; si a l'aula no n'hi ha cap, ho ha d'anotar. A més, reparteix les cèl·lules en divisió entre profase, metafase, anafase i telofase, i té un repte sobre els fàrmacs que encallen les cèl·lules en una fase. La C té la calculadora, un exemple fet i una taula que s'omple de dalt a baix.</w:t>
             </w:r>
           </w:p>
           <w:p>
@@ -7408,7 +8036,7 @@
                 <w:color w:val="1A1A2E"/>
                 <w:sz w:val="18"/>
               </w:rPr>
-              <w:t xml:space="preserve"> la B diu si el fàrmac funciona amb els dos números. La A tria entre eficaç, inútil, tòxic i no concloent, i raona cap a on l'esbiaixaria un error de recompte. La C encercla «ha baixat · és igual · ha pujat» i fa el mètode amb opcions.</w:t>
+              <w:t xml:space="preserve"> la B practica el veredicte amb el cas de mostra i diu si el fàrmac funciona amb dos números. La A tria entre eficaç, inútil, tòxic i no concloent, raona cap a on l'esbiaixaria un error de recompte i per què els assajos es fan a cegues. La C encercla «ha baixat · és igual · ha pujat» i fa el mètode amb opcions.</w:t>
             </w:r>
           </w:p>
         </w:tc>
@@ -7466,7 +8094,7 @@
                 <w:color w:val="1A1A2E"/>
                 <w:sz w:val="18"/>
               </w:rPr>
-              <w:t>Un veredicte amb un sol ratolí i un sol camp de microscopi és fràgil. La posada en comú ho fa visible: equips amb el mateix fàrmac poden arribar a números diferents. D'aquí surt per què els assajos de veritat es fan amb molts casos, amb grup control i a cegues. I a la A: tres cèl·lules mal comptades ja poden moure el veredicte.</w:t>
+              <w:t>Un veredicte amb un sol ratolí i un sol camp de microscopi és fràgil. El seminari ho fa visible: amb el cas de mostra (24 % → 22 %) la diferència és petita, i la pregunta és si és prou per dir que el fàrmac funciona. D'aquí surt per què els assajos de veritat es fan amb molts casos, amb grup control i a cegues. I a la A: tres cèl·lules mal comptades ja poden moure el veredicte. I a la ceba ja ho van veure: l'índex depèn del camp que es mira.</w:t>
             </w:r>
           </w:p>
         </w:tc>
@@ -7585,6 +8213,56 @@
                 <w:sz w:val="18"/>
               </w:rPr>
               <w:t>Acceptar «funciona» sense els dos números que ho demostren.</w:t>
+            </w:r>
+          </w:p>
+          <w:p>
+            <w:pPr>
+              <w:spacing w:after="20" w:before="0"/>
+            </w:pPr>
+            <w:r>
+              <w:rPr>
+                <w:rFonts w:ascii="Fira Sans Extra Condensed" w:hAnsi="Fira Sans Extra Condensed" w:cs="Fira Sans Extra Condensed"/>
+                <w:b/>
+                <w:i w:val="0"/>
+                <w:color w:val="9A3B3B"/>
+                <w:sz w:val="18"/>
+              </w:rPr>
+              <w:t xml:space="preserve">• </w:t>
+            </w:r>
+            <w:r>
+              <w:rPr>
+                <w:rFonts w:ascii="Fira Sans Extra Condensed" w:hAnsi="Fira Sans Extra Condensed" w:cs="Fira Sans Extra Condensed"/>
+                <w:b w:val="0"/>
+                <w:i w:val="0"/>
+                <w:color w:val="9A3B3B"/>
+                <w:sz w:val="18"/>
+              </w:rPr>
+              <w:t>Fer comptar la biòpsia final a classe: avui només la inicial. La final i el veredicte del seu cas són a casa.</w:t>
+            </w:r>
+          </w:p>
+          <w:p>
+            <w:pPr>
+              <w:spacing w:after="20" w:before="0"/>
+            </w:pPr>
+            <w:r>
+              <w:rPr>
+                <w:rFonts w:ascii="Fira Sans Extra Condensed" w:hAnsi="Fira Sans Extra Condensed" w:cs="Fira Sans Extra Condensed"/>
+                <w:b/>
+                <w:i w:val="0"/>
+                <w:color w:val="9A3B3B"/>
+                <w:sz w:val="18"/>
+              </w:rPr>
+              <w:t xml:space="preserve">• </w:t>
+            </w:r>
+            <w:r>
+              <w:rPr>
+                <w:rFonts w:ascii="Fira Sans Extra Condensed" w:hAnsi="Fira Sans Extra Condensed" w:cs="Fira Sans Extra Condensed"/>
+                <w:b w:val="0"/>
+                <w:i w:val="0"/>
+                <w:color w:val="9A3B3B"/>
+                <w:sz w:val="18"/>
+              </w:rPr>
+              <w:t>Resoldre el cas de mostra per ells: ha de ser el mètode que després aplicaran sols.</w:t>
             </w:r>
           </w:p>
         </w:tc>
@@ -7744,6 +8422,31 @@
               <w:t>Fig.1 (com distingir) i Fig.2 (exemple de fitxa) al projector.</w:t>
             </w:r>
           </w:p>
+          <w:p>
+            <w:pPr>
+              <w:spacing w:after="20" w:before="0"/>
+            </w:pPr>
+            <w:r>
+              <w:rPr>
+                <w:rFonts w:ascii="Fira Sans Extra Condensed" w:hAnsi="Fira Sans Extra Condensed" w:cs="Fira Sans Extra Condensed"/>
+                <w:b/>
+                <w:i w:val="0"/>
+                <w:color w:val="7B3F9E"/>
+                <w:sz w:val="18"/>
+              </w:rPr>
+              <w:t xml:space="preserve">• </w:t>
+            </w:r>
+            <w:r>
+              <w:rPr>
+                <w:rFonts w:ascii="Fira Sans Extra Condensed" w:hAnsi="Fira Sans Extra Condensed" w:cs="Fira Sans Extra Condensed"/>
+                <w:b w:val="0"/>
+                <w:i w:val="0"/>
+                <w:color w:val="1A1A2E"/>
+                <w:sz w:val="18"/>
+              </w:rPr>
+              <w:t>Cas de mostra del seminari, a la pissarra.</w:t>
+            </w:r>
+          </w:p>
         </w:tc>
         <w:tc>
           <w:tcPr>
@@ -7771,7 +8474,57 @@
                 <w:color w:val="1A1A2E"/>
                 <w:sz w:val="18"/>
               </w:rPr>
-              <w:t>Mini-informe de 4-5 línies, com la conclusió d'un article: què s'ha mesurat, els números abans i després, i el veredicte.</w:t>
+              <w:t>Acabar el cas: comptar la biòpsia FINAL de la fitxa de pacient, calcular-ne l'índex mitòtic i escriure el veredicte (apartats 1 i 3), com s'ha practicat a classe.</w:t>
+            </w:r>
+          </w:p>
+          <w:p>
+            <w:pPr>
+              <w:spacing w:after="20" w:before="0"/>
+            </w:pPr>
+            <w:r>
+              <w:rPr>
+                <w:rFonts w:ascii="Fira Sans Extra Condensed" w:hAnsi="Fira Sans Extra Condensed" w:cs="Fira Sans Extra Condensed"/>
+                <w:b/>
+                <w:i w:val="0"/>
+                <w:color w:val="7B3F9E"/>
+                <w:sz w:val="18"/>
+              </w:rPr>
+              <w:t xml:space="preserve">2 </w:t>
+            </w:r>
+            <w:r>
+              <w:rPr>
+                <w:rFonts w:ascii="Fira Sans Extra Condensed" w:hAnsi="Fira Sans Extra Condensed" w:cs="Fira Sans Extra Condensed"/>
+                <w:b w:val="0"/>
+                <w:i w:val="0"/>
+                <w:color w:val="1A1A2E"/>
+                <w:sz w:val="18"/>
+              </w:rPr>
+              <w:t>Taula de tres columnes (Mitosi · Meiosi · Càncer): quantes cèl·lules resulten, quin material genètic tenen i on i quan passa al cos. Es porta a la S4.</w:t>
+            </w:r>
+          </w:p>
+          <w:p>
+            <w:pPr>
+              <w:spacing w:after="20" w:before="0"/>
+            </w:pPr>
+            <w:r>
+              <w:rPr>
+                <w:rFonts w:ascii="Fira Sans Extra Condensed" w:hAnsi="Fira Sans Extra Condensed" w:cs="Fira Sans Extra Condensed"/>
+                <w:b/>
+                <w:i w:val="0"/>
+                <w:color w:val="7B3F9E"/>
+                <w:sz w:val="18"/>
+              </w:rPr>
+              <w:t xml:space="preserve">3 </w:t>
+            </w:r>
+            <w:r>
+              <w:rPr>
+                <w:rFonts w:ascii="Fira Sans Extra Condensed" w:hAnsi="Fira Sans Extra Condensed" w:cs="Fira Sans Extra Condensed"/>
+                <w:b w:val="0"/>
+                <w:i w:val="0"/>
+                <w:color w:val="1A1A2E"/>
+                <w:sz w:val="18"/>
+              </w:rPr>
+              <w:t>Acabar el vídeo del procés (peça 1 del producte), amb la rúbrica al davant.</w:t>
             </w:r>
           </w:p>
         </w:tc>
@@ -7799,7 +8552,7 @@
           <w:color w:val="666666"/>
           <w:sz w:val="18"/>
         </w:rPr>
-        <w:t>La S4 ajunta les tres peces: mitosi normal, meiosi i mitosi sense control. Tres casos, tres sospitosos.</w:t>
+        <w:t>La S4 comença amb la posada en comú dels veredictes i ajunta les tres peces: mitosi normal, meiosi i mitosi sense control. Tres casos, tres sospitosos. La segona hora és la prova escrita.</w:t>
       </w:r>
     </w:p>
     <w:p>
@@ -8077,7 +8830,7 @@
                 <w:color w:val="1A1A2E"/>
                 <w:sz w:val="18"/>
               </w:rPr>
-              <w:t>Imprimir la fitxa (A/B/C) i l'exit tiquet.</w:t>
+              <w:t>Imprimir la fitxa (A/B/C) i la prova escrita de la SA («Ostres de tres jocs»), en versió B i en versió C, amb el solucionari a mà (carpeta S4-tancament-repas). Aquesta sessió NO té exit tiquet: la segona hora és la prova.</w:t>
             </w:r>
           </w:p>
           <w:p>
@@ -8127,7 +8880,57 @@
                 <w:color w:val="1A1A2E"/>
                 <w:sz w:val="18"/>
               </w:rPr>
-              <w:t>Recordar que l'alumnat porti els apunts de S1-S3.</w:t>
+              <w:t>Recordar que l'alumnat porti els apunts de S1–S3, la taula de tres columnes (Mitosi · Meiosi · Càncer) i el veredicte del seu cas de la S3. Els apunts serveixen a la primera hora i es desen abans de la prova.</w:t>
+            </w:r>
+          </w:p>
+          <w:p>
+            <w:pPr>
+              <w:spacing w:after="20" w:before="0"/>
+            </w:pPr>
+            <w:r>
+              <w:rPr>
+                <w:rFonts w:ascii="Fira Sans Extra Condensed" w:hAnsi="Fira Sans Extra Condensed" w:cs="Fira Sans Extra Condensed"/>
+                <w:b/>
+                <w:i w:val="0"/>
+                <w:color w:val="7B3F9E"/>
+                <w:sz w:val="18"/>
+              </w:rPr>
+              <w:t xml:space="preserve">4 </w:t>
+            </w:r>
+            <w:r>
+              <w:rPr>
+                <w:rFonts w:ascii="Fira Sans Extra Condensed" w:hAnsi="Fira Sans Extra Condensed" w:cs="Fira Sans Extra Condensed"/>
+                <w:b w:val="0"/>
+                <w:i w:val="0"/>
+                <w:color w:val="1A1A2E"/>
+                <w:sz w:val="18"/>
+              </w:rPr>
+              <w:t>Preparar l'aula per a la prova: taules separades, sense mòbils a la vista.</w:t>
+            </w:r>
+          </w:p>
+          <w:p>
+            <w:pPr>
+              <w:spacing w:after="20" w:before="0"/>
+            </w:pPr>
+            <w:r>
+              <w:rPr>
+                <w:rFonts w:ascii="Fira Sans Extra Condensed" w:hAnsi="Fira Sans Extra Condensed" w:cs="Fira Sans Extra Condensed"/>
+                <w:b/>
+                <w:i w:val="0"/>
+                <w:color w:val="7B3F9E"/>
+                <w:sz w:val="18"/>
+              </w:rPr>
+              <w:t xml:space="preserve">5 </w:t>
+            </w:r>
+            <w:r>
+              <w:rPr>
+                <w:rFonts w:ascii="Fira Sans Extra Condensed" w:hAnsi="Fira Sans Extra Condensed" w:cs="Fira Sans Extra Condensed"/>
+                <w:b w:val="0"/>
+                <w:i w:val="0"/>
+                <w:color w:val="1A1A2E"/>
+                <w:sz w:val="18"/>
+              </w:rPr>
+              <w:t>Tenir present el producte: el vídeo (peça 1, de la S2) i l'informe diagnòstic (peça 2, a casa després de la prova) es lliuren junts, amb la rúbrica del producte.</w:t>
             </w:r>
           </w:p>
         </w:tc>
@@ -8376,7 +9179,7 @@
                 <w:color w:val="666666"/>
                 <w:sz w:val="17"/>
               </w:rPr>
-              <w:t>35 min (A: 40) · apartat 1</w:t>
+              <w:t>30 min (A: 35) · apartat 1</w:t>
             </w:r>
           </w:p>
         </w:tc>
@@ -8384,6 +9187,41 @@
           <w:tcPr>
             <w:tcW w:type="dxa" w:w="4195"/>
           </w:tcPr>
+          <w:p>
+            <w:pPr>
+              <w:spacing w:after="20" w:before="0"/>
+            </w:pPr>
+            <w:r>
+              <w:rPr>
+                <w:rFonts w:ascii="Fira Sans Extra Condensed" w:hAnsi="Fira Sans Extra Condensed" w:cs="Fira Sans Extra Condensed"/>
+                <w:b/>
+                <w:i w:val="0"/>
+                <w:color w:val="7B3F9E"/>
+                <w:sz w:val="18"/>
+              </w:rPr>
+              <w:t xml:space="preserve">• </w:t>
+            </w:r>
+            <w:r>
+              <w:rPr>
+                <w:rFonts w:ascii="Fira Sans Extra Condensed" w:hAnsi="Fira Sans Extra Condensed" w:cs="Fira Sans Extra Condensed"/>
+                <w:b/>
+                <w:i w:val="0"/>
+                <w:color w:val="1A1A2E"/>
+                <w:sz w:val="18"/>
+              </w:rPr>
+              <w:t>Posada en comú dels veredictes de la S3 (5 min):</w:t>
+            </w:r>
+            <w:r>
+              <w:rPr>
+                <w:rFonts w:ascii="Fira Sans Extra Condensed" w:hAnsi="Fira Sans Extra Condensed" w:cs="Fira Sans Extra Condensed"/>
+                <w:b w:val="0"/>
+                <w:i w:val="0"/>
+                <w:color w:val="1A1A2E"/>
+                <w:sz w:val="18"/>
+              </w:rPr>
+              <w:t xml:space="preserve"> cada parella llegeix el seu, amb els números que l'aguanten.</w:t>
+            </w:r>
+          </w:p>
           <w:p>
             <w:pPr>
               <w:spacing w:after="20" w:before="0"/>
@@ -8517,7 +9355,7 @@
                 <w:color w:val="1A1A2E"/>
                 <w:sz w:val="18"/>
               </w:rPr>
-              <w:t>Diagnostiquen els tres casos amb la frase que ho demostra (A: un quart cas amb una conclusió precipitada; C: encercla i inici de frase).</w:t>
+              <w:t>Diagnostiquen els casos amb la frase que ho demostra (A: un quart cas amb una conclusió precipitada; C: encerclen i comencen la frase).</w:t>
             </w:r>
           </w:p>
         </w:tc>
@@ -8555,7 +9393,7 @@
                 <w:color w:val="666666"/>
                 <w:sz w:val="17"/>
               </w:rPr>
-              <w:t>20 min (A: 15) · apartat 2</w:t>
+              <w:t>15 min (A: 10) · apartat 2</w:t>
             </w:r>
           </w:p>
         </w:tc>
@@ -8631,6 +9469,41 @@
                 <w:sz w:val="18"/>
               </w:rPr>
               <w:t xml:space="preserve"> quants cromosomes hi ha ara?</w:t>
+            </w:r>
+          </w:p>
+          <w:p>
+            <w:pPr>
+              <w:spacing w:after="20" w:before="0"/>
+            </w:pPr>
+            <w:r>
+              <w:rPr>
+                <w:rFonts w:ascii="Fira Sans Extra Condensed" w:hAnsi="Fira Sans Extra Condensed" w:cs="Fira Sans Extra Condensed"/>
+                <w:b/>
+                <w:i w:val="0"/>
+                <w:color w:val="7B3F9E"/>
+                <w:sz w:val="18"/>
+              </w:rPr>
+              <w:t xml:space="preserve">• </w:t>
+            </w:r>
+            <w:r>
+              <w:rPr>
+                <w:rFonts w:ascii="Fira Sans Extra Condensed" w:hAnsi="Fira Sans Extra Condensed" w:cs="Fira Sans Extra Condensed"/>
+                <w:b/>
+                <w:i w:val="0"/>
+                <w:color w:val="1A1A2E"/>
+                <w:sz w:val="18"/>
+              </w:rPr>
+              <w:t>Tornar a les tres frases</w:t>
+            </w:r>
+            <w:r>
+              <w:rPr>
+                <w:rFonts w:ascii="Fira Sans Extra Condensed" w:hAnsi="Fira Sans Extra Condensed" w:cs="Fira Sans Extra Condensed"/>
+                <w:b w:val="0"/>
+                <w:i w:val="0"/>
+                <w:color w:val="1A1A2E"/>
+                <w:sz w:val="18"/>
+              </w:rPr>
+              <w:t xml:space="preserve"> de l'apartat 0 i comparar-les.</w:t>
             </w:r>
           </w:p>
         </w:tc>
@@ -8661,7 +9534,32 @@
                 <w:color w:val="1A1A2E"/>
                 <w:sz w:val="18"/>
               </w:rPr>
-              <w:t>Omplen la taula mitosi/meiosi per files (A: un sol esquema dels tres processos des del mateix cicle, amb una fletxa al pas on fallaria un error de repartiment).</w:t>
+              <w:t>Omplen el mapa (A: un sol esquema dels tres processos des del mateix cicle, amb una fletxa al pas on fallaria un error de repartiment).</w:t>
+            </w:r>
+          </w:p>
+          <w:p>
+            <w:pPr>
+              <w:spacing w:after="20" w:before="0"/>
+            </w:pPr>
+            <w:r>
+              <w:rPr>
+                <w:rFonts w:ascii="Fira Sans Extra Condensed" w:hAnsi="Fira Sans Extra Condensed" w:cs="Fira Sans Extra Condensed"/>
+                <w:b/>
+                <w:i w:val="0"/>
+                <w:color w:val="7B3F9E"/>
+                <w:sz w:val="18"/>
+              </w:rPr>
+              <w:t xml:space="preserve">• </w:t>
+            </w:r>
+            <w:r>
+              <w:rPr>
+                <w:rFonts w:ascii="Fira Sans Extra Condensed" w:hAnsi="Fira Sans Extra Condensed" w:cs="Fira Sans Extra Condensed"/>
+                <w:b w:val="0"/>
+                <w:i w:val="0"/>
+                <w:color w:val="1A1A2E"/>
+                <w:sz w:val="18"/>
+              </w:rPr>
+              <w:t>Reescriuen les tres frases i diuen quina ha canviat més.</w:t>
             </w:r>
           </w:p>
         </w:tc>
@@ -8684,7 +9582,7 @@
                 <w:color w:val="7B3F9E"/>
                 <w:sz w:val="21"/>
               </w:rPr>
-              <w:t>Elabora</w:t>
+              <w:t>Prova</w:t>
             </w:r>
           </w:p>
           <w:p>
@@ -8699,7 +9597,7 @@
                 <w:color w:val="666666"/>
                 <w:sz w:val="17"/>
               </w:rPr>
-              <w:t>25 min · apartat 3</w:t>
+              <w:t>60 min (+10 de marge) · apartat 3</w:t>
             </w:r>
           </w:p>
         </w:tc>
@@ -8729,7 +9627,7 @@
                 <w:color w:val="1A1A2E"/>
                 <w:sz w:val="18"/>
               </w:rPr>
-              <w:t>Informe final:</w:t>
+              <w:t>Prova escrita de la SA, a la segona hora:</w:t>
             </w:r>
             <w:r>
               <w:rPr>
@@ -8739,7 +9637,42 @@
                 <w:color w:val="1A1A2E"/>
                 <w:sz w:val="18"/>
               </w:rPr>
-              <w:t xml:space="preserve"> el cas que més els ha costat, amb el mètode (observo · em pregunto · connecto · dedueixo).</w:t>
+              <w:t xml:space="preserve"> individual i sense apunts, en un full a part. Versió B per a la B i la A, versió C per a la C. Abans de començar, deseu la fitxa i els apunts.</w:t>
+            </w:r>
+          </w:p>
+          <w:p>
+            <w:pPr>
+              <w:spacing w:after="20" w:before="0"/>
+            </w:pPr>
+            <w:r>
+              <w:rPr>
+                <w:rFonts w:ascii="Fira Sans Extra Condensed" w:hAnsi="Fira Sans Extra Condensed" w:cs="Fira Sans Extra Condensed"/>
+                <w:b/>
+                <w:i w:val="0"/>
+                <w:color w:val="7B3F9E"/>
+                <w:sz w:val="18"/>
+              </w:rPr>
+              <w:t xml:space="preserve">• </w:t>
+            </w:r>
+            <w:r>
+              <w:rPr>
+                <w:rFonts w:ascii="Fira Sans Extra Condensed" w:hAnsi="Fira Sans Extra Condensed" w:cs="Fira Sans Extra Condensed"/>
+                <w:b/>
+                <w:i w:val="0"/>
+                <w:color w:val="1A1A2E"/>
+                <w:sz w:val="18"/>
+              </w:rPr>
+              <w:t>Els 10 minuts que sobren</w:t>
+            </w:r>
+            <w:r>
+              <w:rPr>
+                <w:rFonts w:ascii="Fira Sans Extra Condensed" w:hAnsi="Fira Sans Extra Condensed" w:cs="Fira Sans Extra Condensed"/>
+                <w:b w:val="0"/>
+                <w:i w:val="0"/>
+                <w:color w:val="1A1A2E"/>
+                <w:sz w:val="18"/>
+              </w:rPr>
+              <w:t xml:space="preserve"> són per repartir la prova i recollir-la; l'alumnat que acaba omple la metacognició.</w:t>
             </w:r>
           </w:p>
         </w:tc>
@@ -8770,260 +9703,7 @@
                 <w:color w:val="1A1A2E"/>
                 <w:sz w:val="18"/>
               </w:rPr>
-              <w:t>Escriuen l'informe sols (A: el quart cas, amb vocabulari tècnic i sense arrodonir dades).</w:t>
-            </w:r>
-          </w:p>
-        </w:tc>
-      </w:tr>
-      <w:tr>
-        <w:tc>
-          <w:tcPr>
-            <w:tcW w:type="dxa" w:w="1644"/>
-            <w:shd w:val="clear" w:fill="F1E9F6"/>
-          </w:tcPr>
-          <w:p>
-            <w:pPr>
-              <w:spacing w:after="0" w:before="0"/>
-            </w:pPr>
-            <w:r>
-              <w:rPr>
-                <w:rFonts w:ascii="Fira Sans Extra Condensed" w:hAnsi="Fira Sans Extra Condensed" w:cs="Fira Sans Extra Condensed"/>
-                <w:b/>
-                <w:i w:val="0"/>
-                <w:color w:val="7B3F9E"/>
-                <w:sz w:val="21"/>
-              </w:rPr>
-              <w:t>Elabora</w:t>
-            </w:r>
-          </w:p>
-          <w:p>
-            <w:pPr>
-              <w:spacing w:after="0" w:before="0"/>
-            </w:pPr>
-            <w:r>
-              <w:rPr>
-                <w:rFonts w:ascii="Fira Sans Extra Condensed" w:hAnsi="Fira Sans Extra Condensed" w:cs="Fira Sans Extra Condensed"/>
-                <w:b w:val="0"/>
-                <w:i w:val="0"/>
-                <w:color w:val="666666"/>
-                <w:sz w:val="17"/>
-              </w:rPr>
-              <w:t>15 min · apartat 4</w:t>
-            </w:r>
-          </w:p>
-        </w:tc>
-        <w:tc>
-          <w:tcPr>
-            <w:tcW w:type="dxa" w:w="4195"/>
-          </w:tcPr>
-          <w:p>
-            <w:pPr>
-              <w:spacing w:after="20" w:before="0"/>
-            </w:pPr>
-            <w:r>
-              <w:rPr>
-                <w:rFonts w:ascii="Fira Sans Extra Condensed" w:hAnsi="Fira Sans Extra Condensed" w:cs="Fira Sans Extra Condensed"/>
-                <w:b/>
-                <w:i w:val="0"/>
-                <w:color w:val="7B3F9E"/>
-                <w:sz w:val="18"/>
-              </w:rPr>
-              <w:t xml:space="preserve">• </w:t>
-            </w:r>
-            <w:r>
-              <w:rPr>
-                <w:rFonts w:ascii="Fira Sans Extra Condensed" w:hAnsi="Fira Sans Extra Condensed" w:cs="Fira Sans Extra Condensed"/>
-                <w:b/>
-                <w:i w:val="0"/>
-                <w:color w:val="1A1A2E"/>
-                <w:sz w:val="18"/>
-              </w:rPr>
-              <w:t>Tornar a les tres frases</w:t>
-            </w:r>
-            <w:r>
-              <w:rPr>
-                <w:rFonts w:ascii="Fira Sans Extra Condensed" w:hAnsi="Fira Sans Extra Condensed" w:cs="Fira Sans Extra Condensed"/>
-                <w:b w:val="0"/>
-                <w:i w:val="0"/>
-                <w:color w:val="1A1A2E"/>
-                <w:sz w:val="18"/>
-              </w:rPr>
-              <w:t xml:space="preserve"> i comparar-les amb les de l'apartat 0.</w:t>
-            </w:r>
-          </w:p>
-        </w:tc>
-        <w:tc>
-          <w:tcPr>
-            <w:tcW w:type="dxa" w:w="4025"/>
-            <w:shd w:val="clear" w:fill="F8F4FB"/>
-          </w:tcPr>
-          <w:p>
-            <w:pPr>
-              <w:spacing w:after="20" w:before="0"/>
-            </w:pPr>
-            <w:r>
-              <w:rPr>
-                <w:rFonts w:ascii="Fira Sans Extra Condensed" w:hAnsi="Fira Sans Extra Condensed" w:cs="Fira Sans Extra Condensed"/>
-                <w:b/>
-                <w:i w:val="0"/>
-                <w:color w:val="7B3F9E"/>
-                <w:sz w:val="18"/>
-              </w:rPr>
-              <w:t xml:space="preserve">• </w:t>
-            </w:r>
-            <w:r>
-              <w:rPr>
-                <w:rFonts w:ascii="Fira Sans Extra Condensed" w:hAnsi="Fira Sans Extra Condensed" w:cs="Fira Sans Extra Condensed"/>
-                <w:b w:val="0"/>
-                <w:i w:val="0"/>
-                <w:color w:val="1A1A2E"/>
-                <w:sz w:val="18"/>
-              </w:rPr>
-              <w:t>Reescriuen les frases i diuen quina ha canviat més (A: inventen un cas-trampa per a un company).</w:t>
-            </w:r>
-          </w:p>
-        </w:tc>
-      </w:tr>
-      <w:tr>
-        <w:tc>
-          <w:tcPr>
-            <w:tcW w:type="dxa" w:w="1644"/>
-            <w:shd w:val="clear" w:fill="F1E9F6"/>
-          </w:tcPr>
-          <w:p>
-            <w:pPr>
-              <w:spacing w:after="0" w:before="0"/>
-            </w:pPr>
-            <w:r>
-              <w:rPr>
-                <w:rFonts w:ascii="Fira Sans Extra Condensed" w:hAnsi="Fira Sans Extra Condensed" w:cs="Fira Sans Extra Condensed"/>
-                <w:b/>
-                <w:i w:val="0"/>
-                <w:color w:val="7B3F9E"/>
-                <w:sz w:val="21"/>
-              </w:rPr>
-              <w:t>Evaluate</w:t>
-            </w:r>
-          </w:p>
-          <w:p>
-            <w:pPr>
-              <w:spacing w:after="0" w:before="0"/>
-            </w:pPr>
-            <w:r>
-              <w:rPr>
-                <w:rFonts w:ascii="Fira Sans Extra Condensed" w:hAnsi="Fira Sans Extra Condensed" w:cs="Fira Sans Extra Condensed"/>
-                <w:b w:val="0"/>
-                <w:i w:val="0"/>
-                <w:color w:val="666666"/>
-                <w:sz w:val="17"/>
-              </w:rPr>
-              <w:t>10 min</w:t>
-            </w:r>
-          </w:p>
-        </w:tc>
-        <w:tc>
-          <w:tcPr>
-            <w:tcW w:type="dxa" w:w="4195"/>
-          </w:tcPr>
-          <w:p>
-            <w:pPr>
-              <w:spacing w:after="20" w:before="0"/>
-            </w:pPr>
-            <w:r>
-              <w:rPr>
-                <w:rFonts w:ascii="Fira Sans Extra Condensed" w:hAnsi="Fira Sans Extra Condensed" w:cs="Fira Sans Extra Condensed"/>
-                <w:b/>
-                <w:i w:val="0"/>
-                <w:color w:val="7B3F9E"/>
-                <w:sz w:val="18"/>
-              </w:rPr>
-              <w:t xml:space="preserve">• </w:t>
-            </w:r>
-            <w:r>
-              <w:rPr>
-                <w:rFonts w:ascii="Fira Sans Extra Condensed" w:hAnsi="Fira Sans Extra Condensed" w:cs="Fira Sans Extra Condensed"/>
-                <w:b/>
-                <w:i w:val="0"/>
-                <w:color w:val="1A1A2E"/>
-                <w:sz w:val="18"/>
-              </w:rPr>
-              <w:t>Exit tiquet imprès:</w:t>
-            </w:r>
-            <w:r>
-              <w:rPr>
-                <w:rFonts w:ascii="Fira Sans Extra Condensed" w:hAnsi="Fira Sans Extra Condensed" w:cs="Fira Sans Extra Condensed"/>
-                <w:b w:val="0"/>
-                <w:i w:val="0"/>
-                <w:color w:val="1A1A2E"/>
-                <w:sz w:val="18"/>
-              </w:rPr>
-              <w:t xml:space="preserve"> què diferencia la mitosi, la meiosi i el càncer si parteixen del mateix cicle (criteri 1.1).</w:t>
-            </w:r>
-          </w:p>
-          <w:p>
-            <w:pPr>
-              <w:spacing w:after="20" w:before="0"/>
-            </w:pPr>
-            <w:r>
-              <w:rPr>
-                <w:rFonts w:ascii="Fira Sans Extra Condensed" w:hAnsi="Fira Sans Extra Condensed" w:cs="Fira Sans Extra Condensed"/>
-                <w:b/>
-                <w:i w:val="0"/>
-                <w:color w:val="7B3F9E"/>
-                <w:sz w:val="18"/>
-              </w:rPr>
-              <w:t xml:space="preserve">• </w:t>
-            </w:r>
-            <w:r>
-              <w:rPr>
-                <w:rFonts w:ascii="Fira Sans Extra Condensed" w:hAnsi="Fira Sans Extra Condensed" w:cs="Fira Sans Extra Condensed"/>
-                <w:b/>
-                <w:i w:val="0"/>
-                <w:color w:val="1A1A2E"/>
-                <w:sz w:val="18"/>
-              </w:rPr>
-              <w:t>Anunciar la prova</w:t>
-            </w:r>
-            <w:r>
-              <w:rPr>
-                <w:rFonts w:ascii="Fira Sans Extra Condensed" w:hAnsi="Fira Sans Extra Condensed" w:cs="Fira Sans Extra Condensed"/>
-                <w:b w:val="0"/>
-                <w:i w:val="0"/>
-                <w:color w:val="1A1A2E"/>
-                <w:sz w:val="18"/>
-              </w:rPr>
-              <w:t xml:space="preserve"> i el que cal portar: la taula dels deures.</w:t>
-            </w:r>
-          </w:p>
-        </w:tc>
-        <w:tc>
-          <w:tcPr>
-            <w:tcW w:type="dxa" w:w="4025"/>
-            <w:shd w:val="clear" w:fill="F8F4FB"/>
-          </w:tcPr>
-          <w:p>
-            <w:pPr>
-              <w:spacing w:after="20" w:before="0"/>
-            </w:pPr>
-            <w:r>
-              <w:rPr>
-                <w:rFonts w:ascii="Fira Sans Extra Condensed" w:hAnsi="Fira Sans Extra Condensed" w:cs="Fira Sans Extra Condensed"/>
-                <w:b/>
-                <w:i w:val="0"/>
-                <w:color w:val="7B3F9E"/>
-                <w:sz w:val="18"/>
-              </w:rPr>
-              <w:t xml:space="preserve">• </w:t>
-            </w:r>
-            <w:r>
-              <w:rPr>
-                <w:rFonts w:ascii="Fira Sans Extra Condensed" w:hAnsi="Fira Sans Extra Condensed" w:cs="Fira Sans Extra Condensed"/>
-                <w:b w:val="0"/>
-                <w:i w:val="0"/>
-                <w:color w:val="1A1A2E"/>
-                <w:sz w:val="18"/>
-              </w:rPr>
-              <w:t>Fan l'exit tiquet i la metacognició de tota la SA.</w:t>
+              <w:t>Fan la prova sols i, en acabar, la metacognició de tota la SA.</w:t>
             </w:r>
           </w:p>
         </w:tc>
@@ -9101,7 +9781,7 @@
                 <w:color w:val="1A1A2E"/>
                 <w:sz w:val="18"/>
               </w:rPr>
-              <w:t xml:space="preserve"> la B diagnostica tres casos. La A en té un quart: una mostra amb un índex encara més alt i un tècnic que en treu una conclusió precipitada; ha de trobar on falla el raonament. La C encercla MITOSI · MEIOSI · CÀNCER amb la regla «curar i créixer · fills · no para» escrita al full, i calcula l'índex del cas 2.</w:t>
+              <w:t xml:space="preserve"> la B diagnostica tres casos. La A en té un quart: una mostra de medul·la òssia amb un índex del 44 % i un tècnic que en treu una conclusió precipitada; ha de trobar contra quin valor havia de comparar aquest número. La C encercla MITOSI · MEIOSI · CÀNCER amb la regla «curar i créixer · fills · no para» escrita al full, i calcula l'índex del cas 2.</w:t>
             </w:r>
           </w:p>
           <w:p>
@@ -9161,7 +9841,7 @@
                 <w:color w:val="1A1A2E"/>
                 <w:sz w:val="18"/>
               </w:rPr>
-              <w:t>Apartat 4 —</w:t>
+              <w:t>Apartat 3 —</w:t>
             </w:r>
             <w:r>
               <w:rPr>
@@ -9171,7 +9851,42 @@
                 <w:color w:val="1A1A2E"/>
                 <w:sz w:val="18"/>
               </w:rPr>
-              <w:t xml:space="preserve"> la B i la C tornen a les tres frases. La A, a més, inventa un cas-trampa (un número que sembla alarmant i no ho és) i l'intercanvia.</w:t>
+              <w:t xml:space="preserve"> tothom fa la prova a la segona hora. La B i la C tenen versió pròpia; la A fa la B.</w:t>
+            </w:r>
+          </w:p>
+          <w:p>
+            <w:pPr>
+              <w:spacing w:after="20" w:before="0"/>
+            </w:pPr>
+            <w:r>
+              <w:rPr>
+                <w:rFonts w:ascii="Fira Sans Extra Condensed" w:hAnsi="Fira Sans Extra Condensed" w:cs="Fira Sans Extra Condensed"/>
+                <w:b/>
+                <w:i w:val="0"/>
+                <w:color w:val="7B3F9E"/>
+                <w:sz w:val="18"/>
+              </w:rPr>
+              <w:t xml:space="preserve">• </w:t>
+            </w:r>
+            <w:r>
+              <w:rPr>
+                <w:rFonts w:ascii="Fira Sans Extra Condensed" w:hAnsi="Fira Sans Extra Condensed" w:cs="Fira Sans Extra Condensed"/>
+                <w:b/>
+                <w:i w:val="0"/>
+                <w:color w:val="1A1A2E"/>
+                <w:sz w:val="18"/>
+              </w:rPr>
+              <w:t>A casa —</w:t>
+            </w:r>
+            <w:r>
+              <w:rPr>
+                <w:rFonts w:ascii="Fira Sans Extra Condensed" w:hAnsi="Fira Sans Extra Condensed" w:cs="Fira Sans Extra Condensed"/>
+                <w:b w:val="0"/>
+                <w:i w:val="0"/>
+                <w:color w:val="1A1A2E"/>
+                <w:sz w:val="18"/>
+              </w:rPr>
+              <w:t xml:space="preserve"> la B i la A fan l'informe de diagnòstic dels casos. La A, a més, redacta l'informe del cas 4 per al donant i diu quin dels problemes es podria heretar. La C tria el cas que més li ha costat i l'explica amb el mètode (observo, em pregunto, connecto, dedueixo).</w:t>
             </w:r>
           </w:p>
         </w:tc>
@@ -9229,7 +9944,7 @@
                 <w:color w:val="1A1A2E"/>
                 <w:sz w:val="18"/>
               </w:rPr>
-              <w:t>Un número no diu res sol: el 35 % del cas 2 és alarmant en un múscul i seria normal en l'intestí. La mateixa idea tanca la SA: per diagnosticar cal saber amb què comparar. És el que la A ha de detectar al quart cas, i el que val la pena dir en veu alta a tothom abans de l'exit tiquet.</w:t>
+              <w:t>Un número no diu res sol: el 35 % del cas 2 és alarmant en un múscul i seria normal en l'intestí. La mateixa idea tanca la SA: per diagnosticar cal saber amb què comparar. És el que la A ha de detectar al quart cas, i el que val la pena dir en veu alta a tothom abans de la prova.</w:t>
             </w:r>
           </w:p>
         </w:tc>
@@ -9348,6 +10063,31 @@
                 <w:sz w:val="18"/>
               </w:rPr>
               <w:t>Dir que l'espermatozoide del cas 3 té «el doble»: té un de cada parella DUES vegades, perquè la meiosi no ha separat les parelles.</w:t>
+            </w:r>
+          </w:p>
+          <w:p>
+            <w:pPr>
+              <w:spacing w:after="20" w:before="0"/>
+            </w:pPr>
+            <w:r>
+              <w:rPr>
+                <w:rFonts w:ascii="Fira Sans Extra Condensed" w:hAnsi="Fira Sans Extra Condensed" w:cs="Fira Sans Extra Condensed"/>
+                <w:b/>
+                <w:i w:val="0"/>
+                <w:color w:val="9A3B3B"/>
+                <w:sz w:val="18"/>
+              </w:rPr>
+              <w:t xml:space="preserve">• </w:t>
+            </w:r>
+            <w:r>
+              <w:rPr>
+                <w:rFonts w:ascii="Fira Sans Extra Condensed" w:hAnsi="Fira Sans Extra Condensed" w:cs="Fira Sans Extra Condensed"/>
+                <w:b w:val="0"/>
+                <w:i w:val="0"/>
+                <w:color w:val="9A3B3B"/>
+                <w:sz w:val="18"/>
+              </w:rPr>
+              <w:t>Deixar la fitxa o els apunts a la taula durant la prova.</w:t>
             </w:r>
           </w:p>
         </w:tc>
@@ -9454,7 +10194,7 @@
                 <w:color w:val="1A1A2E"/>
                 <w:sz w:val="18"/>
               </w:rPr>
-              <w:t>Fitxa S4 (A/B/C) i exit tiquet.</w:t>
+              <w:t>Fitxa S4 (A/B/C).</w:t>
             </w:r>
           </w:p>
           <w:p>
@@ -9479,7 +10219,7 @@
                 <w:color w:val="1A1A2E"/>
                 <w:sz w:val="18"/>
               </w:rPr>
-              <w:t>Figures de repàs de S1-S3 al projector.</w:t>
+              <w:t>Prova escrita («Ostres de tres jocs», versions B i C) i solucionari.</w:t>
             </w:r>
           </w:p>
           <w:p>
@@ -9504,7 +10244,32 @@
                 <w:color w:val="1A1A2E"/>
                 <w:sz w:val="18"/>
               </w:rPr>
-              <w:t>Apunts de S1-S3 de l'alumnat.</w:t>
+              <w:t>Figures de repàs de S1–S3 al projector.</w:t>
+            </w:r>
+          </w:p>
+          <w:p>
+            <w:pPr>
+              <w:spacing w:after="20" w:before="0"/>
+            </w:pPr>
+            <w:r>
+              <w:rPr>
+                <w:rFonts w:ascii="Fira Sans Extra Condensed" w:hAnsi="Fira Sans Extra Condensed" w:cs="Fira Sans Extra Condensed"/>
+                <w:b/>
+                <w:i w:val="0"/>
+                <w:color w:val="7B3F9E"/>
+                <w:sz w:val="18"/>
+              </w:rPr>
+              <w:t xml:space="preserve">• </w:t>
+            </w:r>
+            <w:r>
+              <w:rPr>
+                <w:rFonts w:ascii="Fira Sans Extra Condensed" w:hAnsi="Fira Sans Extra Condensed" w:cs="Fira Sans Extra Condensed"/>
+                <w:b w:val="0"/>
+                <w:i w:val="0"/>
+                <w:color w:val="1A1A2E"/>
+                <w:sz w:val="18"/>
+              </w:rPr>
+              <w:t>Apunts de S1–S3, taula de tres columnes i veredicte de la S3 de l'alumnat.</w:t>
             </w:r>
           </w:p>
         </w:tc>
@@ -9534,7 +10299,32 @@
                 <w:color w:val="1A1A2E"/>
                 <w:sz w:val="18"/>
               </w:rPr>
-              <w:t>Taula de tres columnes (Mitosi · Meiosi · Càncer): quantes cèl·lules resulten, quin material genètic tenen, i on i quan passa al cos. Es porta a la prova.</w:t>
+              <w:t>Peça 2 del producte, després de la prova: l'informe final de diagnòstic. La conclusió dels casos de la fitxa com un informe mèdic («El cas ___ és ___ perquè ___»), amb la dada que demostra cada un, i 3-4 línies sobre per què els tres processos importen al cos.</w:t>
+            </w:r>
+          </w:p>
+          <w:p>
+            <w:pPr>
+              <w:spacing w:after="20" w:before="0"/>
+            </w:pPr>
+            <w:r>
+              <w:rPr>
+                <w:rFonts w:ascii="Fira Sans Extra Condensed" w:hAnsi="Fira Sans Extra Condensed" w:cs="Fira Sans Extra Condensed"/>
+                <w:b/>
+                <w:i w:val="0"/>
+                <w:color w:val="7B3F9E"/>
+                <w:sz w:val="18"/>
+              </w:rPr>
+              <w:t xml:space="preserve">2 </w:t>
+            </w:r>
+            <w:r>
+              <w:rPr>
+                <w:rFonts w:ascii="Fira Sans Extra Condensed" w:hAnsi="Fira Sans Extra Condensed" w:cs="Fira Sans Extra Condensed"/>
+                <w:b w:val="0"/>
+                <w:i w:val="0"/>
+                <w:color w:val="1A1A2E"/>
+                <w:sz w:val="18"/>
+              </w:rPr>
+              <w:t>Lliurar-lo juntament amb el vídeo del procés (peça 1), revisats amb la rúbrica del producte.</w:t>
             </w:r>
           </w:p>
         </w:tc>
@@ -9562,7 +10352,7 @@
           <w:color w:val="666666"/>
           <w:sz w:val="18"/>
         </w:rPr>
-        <w:t>Després ve la prova escrita de la SA («Ostres de tres jocs»): mitosi, meiosi i nombre de cromosomes en un context nou.</w:t>
+        <w:t>Aquí s'acaba la SA. Queda el producte (vídeo + informe) i, a l'Additio, el tancament de la SA2.</w:t>
       </w:r>
     </w:p>
     <w:p>
@@ -10188,7 +10978,7 @@
                 <w:color w:val="1A1A2E"/>
                 <w:sz w:val="18"/>
               </w:rPr>
-              <w:t>Web (apartat 3), pas a pas amb les fletxes; l'últim pas tanca la sessió</w:t>
+              <w:t>Web (apartat 3), pas a pas amb les fletxes; l'últim pas és «sense meiosi»</w:t>
             </w:r>
           </w:p>
         </w:tc>
@@ -10251,7 +11041,7 @@
                 <w:color w:val="1A1A2E"/>
                 <w:sz w:val="18"/>
               </w:rPr>
-              <w:t>Web; comptador de cromosomes a cada fase</w:t>
+              <w:t>Web; comptador de cromosomes a cada fase. Serveix per repassar i per preparar el vídeo</w:t>
             </w:r>
           </w:p>
         </w:tc>
@@ -10274,7 +11064,7 @@
                 <w:color w:val="1A1A2E"/>
                 <w:sz w:val="18"/>
               </w:rPr>
-              <w:t>Fitxes de pacient (biòpsies)</w:t>
+              <w:t>Laboratori virtual de la ceba (app_lab_ceba.html)</w:t>
             </w:r>
           </w:p>
         </w:tc>
@@ -10294,7 +11084,7 @@
                 <w:color w:val="1A1A2E"/>
                 <w:sz w:val="18"/>
               </w:rPr>
-              <w:t>S3</w:t>
+              <w:t>S2</w:t>
             </w:r>
           </w:p>
         </w:tc>
@@ -10314,7 +11104,7 @@
                 <w:color w:val="1A1A2E"/>
                 <w:sz w:val="18"/>
               </w:rPr>
-              <w:t>Una per equip; carpeta S3-index-mitotic/biopsies-pacients</w:t>
+              <w:t>Web; per a qui ha faltat o no li surt la preparació</w:t>
             </w:r>
           </w:p>
         </w:tc>
@@ -10337,7 +11127,7 @@
                 <w:color w:val="1A1A2E"/>
                 <w:sz w:val="18"/>
               </w:rPr>
-              <w:t>Exit tiquets (mig A4, criteri imprès)</w:t>
+              <w:t>Rúbrica del producte (rubrica_maqueta_informe_sa2.html)</w:t>
             </w:r>
           </w:p>
         </w:tc>
@@ -10357,7 +11147,7 @@
                 <w:color w:val="1A1A2E"/>
                 <w:sz w:val="18"/>
               </w:rPr>
-              <w:t>S1–S4</w:t>
+              <w:t>S2–S4</w:t>
             </w:r>
           </w:p>
         </w:tc>
@@ -10377,7 +11167,7 @@
                 <w:color w:val="1A1A2E"/>
                 <w:sz w:val="18"/>
               </w:rPr>
-              <w:t>Impresos (B/A i C); també al web</w:t>
+              <w:t>Es mostra a la S2 en acabar i es fa servir per al vídeo i l'informe</w:t>
             </w:r>
           </w:p>
         </w:tc>
@@ -10400,7 +11190,7 @@
                 <w:color w:val="1A1A2E"/>
                 <w:sz w:val="18"/>
               </w:rPr>
-              <w:t>Prova escrita B i C + solucionari</w:t>
+              <w:t>Fitxes de pacient (biòpsies)</w:t>
             </w:r>
           </w:p>
         </w:tc>
@@ -10420,7 +11210,133 @@
                 <w:color w:val="1A1A2E"/>
                 <w:sz w:val="18"/>
               </w:rPr>
-              <w:t>Després de la S4</w:t>
+              <w:t>S3</w:t>
+            </w:r>
+          </w:p>
+        </w:tc>
+        <w:tc>
+          <w:tcPr>
+            <w:tcW w:type="dxa" w:w="3855"/>
+          </w:tcPr>
+          <w:p>
+            <w:pPr>
+              <w:spacing w:after="0" w:before="0"/>
+            </w:pPr>
+            <w:r>
+              <w:rPr>
+                <w:rFonts w:ascii="Fira Sans Extra Condensed" w:hAnsi="Fira Sans Extra Condensed" w:cs="Fira Sans Extra Condensed"/>
+                <w:b w:val="0"/>
+                <w:i w:val="0"/>
+                <w:color w:val="1A1A2E"/>
+                <w:sz w:val="18"/>
+              </w:rPr>
+              <w:t>Una per equip; carpeta S3-index-mitotic/biopsies-pacients</w:t>
+            </w:r>
+          </w:p>
+        </w:tc>
+      </w:tr>
+      <w:tr>
+        <w:tc>
+          <w:tcPr>
+            <w:tcW w:type="dxa" w:w="4762"/>
+            <w:shd w:val="clear" w:fill="F1E9F6"/>
+          </w:tcPr>
+          <w:p>
+            <w:pPr>
+              <w:spacing w:after="0" w:before="0"/>
+            </w:pPr>
+            <w:r>
+              <w:rPr>
+                <w:rFonts w:ascii="Fira Sans Extra Condensed" w:hAnsi="Fira Sans Extra Condensed" w:cs="Fira Sans Extra Condensed"/>
+                <w:b/>
+                <w:i w:val="0"/>
+                <w:color w:val="1A1A2E"/>
+                <w:sz w:val="18"/>
+              </w:rPr>
+              <w:t>Exit tiquets (mig A4, criteri imprès)</w:t>
+            </w:r>
+          </w:p>
+        </w:tc>
+        <w:tc>
+          <w:tcPr>
+            <w:tcW w:type="dxa" w:w="1247"/>
+          </w:tcPr>
+          <w:p>
+            <w:pPr>
+              <w:spacing w:after="0" w:before="0"/>
+            </w:pPr>
+            <w:r>
+              <w:rPr>
+                <w:rFonts w:ascii="Fira Sans Extra Condensed" w:hAnsi="Fira Sans Extra Condensed" w:cs="Fira Sans Extra Condensed"/>
+                <w:b w:val="0"/>
+                <w:i w:val="0"/>
+                <w:color w:val="1A1A2E"/>
+                <w:sz w:val="18"/>
+              </w:rPr>
+              <w:t>S1–S3</w:t>
+            </w:r>
+          </w:p>
+        </w:tc>
+        <w:tc>
+          <w:tcPr>
+            <w:tcW w:type="dxa" w:w="3855"/>
+          </w:tcPr>
+          <w:p>
+            <w:pPr>
+              <w:spacing w:after="0" w:before="0"/>
+            </w:pPr>
+            <w:r>
+              <w:rPr>
+                <w:rFonts w:ascii="Fira Sans Extra Condensed" w:hAnsi="Fira Sans Extra Condensed" w:cs="Fira Sans Extra Condensed"/>
+                <w:b w:val="0"/>
+                <w:i w:val="0"/>
+                <w:color w:val="1A1A2E"/>
+                <w:sz w:val="18"/>
+              </w:rPr>
+              <w:t>Impresos (B/A i C); també al web</w:t>
+            </w:r>
+          </w:p>
+        </w:tc>
+      </w:tr>
+      <w:tr>
+        <w:tc>
+          <w:tcPr>
+            <w:tcW w:type="dxa" w:w="4762"/>
+            <w:shd w:val="clear" w:fill="F1E9F6"/>
+          </w:tcPr>
+          <w:p>
+            <w:pPr>
+              <w:spacing w:after="0" w:before="0"/>
+            </w:pPr>
+            <w:r>
+              <w:rPr>
+                <w:rFonts w:ascii="Fira Sans Extra Condensed" w:hAnsi="Fira Sans Extra Condensed" w:cs="Fira Sans Extra Condensed"/>
+                <w:b/>
+                <w:i w:val="0"/>
+                <w:color w:val="1A1A2E"/>
+                <w:sz w:val="18"/>
+              </w:rPr>
+              <w:t>Prova escrita B i C + solucionari</w:t>
+            </w:r>
+          </w:p>
+        </w:tc>
+        <w:tc>
+          <w:tcPr>
+            <w:tcW w:type="dxa" w:w="1247"/>
+          </w:tcPr>
+          <w:p>
+            <w:pPr>
+              <w:spacing w:after="0" w:before="0"/>
+            </w:pPr>
+            <w:r>
+              <w:rPr>
+                <w:rFonts w:ascii="Fira Sans Extra Condensed" w:hAnsi="Fira Sans Extra Condensed" w:cs="Fira Sans Extra Condensed"/>
+                <w:b w:val="0"/>
+                <w:i w:val="0"/>
+                <w:color w:val="1A1A2E"/>
+                <w:sz w:val="18"/>
+              </w:rPr>
+              <w:t>S4 (segona hora)</w:t>
             </w:r>
           </w:p>
         </w:tc>
@@ -10458,7 +11374,7 @@
           <w:color w:val="7B3F9E"/>
           <w:sz w:val="26"/>
         </w:rPr>
-        <w:t>Plantilla del manipulatiu de la S2 (per parella)</w:t>
+        <w:t>Protocol i material del laboratori de la ceba (S2, per parella)</w:t>
       </w:r>
     </w:p>
     <w:tbl>
@@ -10478,14 +11394,14 @@
         <w:tblLayout w:type="fixed"/>
       </w:tblPr>
       <w:tblGrid>
-        <w:gridCol w:w="3628"/>
-        <w:gridCol w:w="3118"/>
-        <w:gridCol w:w="3118"/>
+        <w:gridCol w:w="680"/>
+        <w:gridCol w:w="4989"/>
+        <w:gridCol w:w="4195"/>
       </w:tblGrid>
       <w:tr>
         <w:tc>
           <w:tcPr>
-            <w:tcW w:type="dxa" w:w="3628"/>
+            <w:tcW w:type="dxa" w:w="680"/>
             <w:shd w:val="clear" w:fill="7B3F9E"/>
           </w:tcPr>
           <w:p>
@@ -10500,13 +11416,13 @@
                 <w:color w:val="FFFFFF"/>
                 <w:sz w:val="19"/>
               </w:rPr>
-              <w:t>Peça</w:t>
+              <w:t>Pas</w:t>
             </w:r>
           </w:p>
         </w:tc>
         <w:tc>
           <w:tcPr>
-            <w:tcW w:type="dxa" w:w="3118"/>
+            <w:tcW w:type="dxa" w:w="4989"/>
             <w:shd w:val="clear" w:fill="7B3F9E"/>
           </w:tcPr>
           <w:p>
@@ -10521,13 +11437,13 @@
                 <w:color w:val="FFFFFF"/>
                 <w:sz w:val="19"/>
               </w:rPr>
-              <w:t>Nivell B</w:t>
+              <w:t>Què es fa</w:t>
             </w:r>
           </w:p>
         </w:tc>
         <w:tc>
           <w:tcPr>
-            <w:tcW w:type="dxa" w:w="3118"/>
+            <w:tcW w:type="dxa" w:w="4195"/>
             <w:shd w:val="clear" w:fill="7B3F9E"/>
           </w:tcPr>
           <w:p>
@@ -10542,7 +11458,7 @@
                 <w:color w:val="FFFFFF"/>
                 <w:sz w:val="19"/>
               </w:rPr>
-              <w:t>Nivell A</w:t>
+              <w:t>Per què (ho han de saber explicar)</w:t>
             </w:r>
           </w:p>
         </w:tc>
@@ -10550,7 +11466,7 @@
       <w:tr>
         <w:tc>
           <w:tcPr>
-            <w:tcW w:type="dxa" w:w="3628"/>
+            <w:tcW w:type="dxa" w:w="680"/>
             <w:shd w:val="clear" w:fill="F1E9F6"/>
           </w:tcPr>
           <w:p>
@@ -10565,13 +11481,13 @@
                 <w:color w:val="1A1A2E"/>
                 <w:sz w:val="18"/>
               </w:rPr>
-              <w:t>Parelles de partida</w:t>
+              <w:t>1</w:t>
             </w:r>
           </w:p>
         </w:tc>
         <w:tc>
           <w:tcPr>
-            <w:tcW w:type="dxa" w:w="3118"/>
+            <w:tcW w:type="dxa" w:w="4989"/>
           </w:tcPr>
           <w:p>
             <w:pPr>
@@ -10585,13 +11501,13 @@
                 <w:color w:val="1A1A2E"/>
                 <w:sz w:val="18"/>
               </w:rPr>
-              <w:t>2 (una llarga, una curta)</w:t>
+              <w:t>Tallar només els 2-3 mm de la punta de 2-3 arrels i posar-les al vidre de rellotge amb 2-3 ml d'orceïna A</w:t>
             </w:r>
           </w:p>
         </w:tc>
         <w:tc>
           <w:tcPr>
-            <w:tcW w:type="dxa" w:w="3118"/>
+            <w:tcW w:type="dxa" w:w="4195"/>
           </w:tcPr>
           <w:p>
             <w:pPr>
@@ -10605,7 +11521,7 @@
                 <w:color w:val="1A1A2E"/>
                 <w:sz w:val="18"/>
               </w:rPr>
-              <w:t>3 (llarga, mitjana, curta)</w:t>
+              <w:t>Les arrels creixen per la punta: allà les cèl·lules es divideixen sense parar</w:t>
             </w:r>
           </w:p>
         </w:tc>
@@ -10613,7 +11529,7 @@
       <w:tr>
         <w:tc>
           <w:tcPr>
-            <w:tcW w:type="dxa" w:w="3628"/>
+            <w:tcW w:type="dxa" w:w="680"/>
             <w:shd w:val="clear" w:fill="F1E9F6"/>
           </w:tcPr>
           <w:p>
@@ -10628,13 +11544,13 @@
                 <w:color w:val="1A1A2E"/>
                 <w:sz w:val="18"/>
               </w:rPr>
-              <w:t>Xurros vermells (mare)</w:t>
+              <w:t>2</w:t>
             </w:r>
           </w:p>
         </w:tc>
         <w:tc>
           <w:tcPr>
-            <w:tcW w:type="dxa" w:w="3118"/>
+            <w:tcW w:type="dxa" w:w="4989"/>
           </w:tcPr>
           <w:p>
             <w:pPr>
@@ -10648,13 +11564,13 @@
                 <w:color w:val="1A1A2E"/>
                 <w:sz w:val="18"/>
               </w:rPr>
-              <w:t>2, un de cada mida</w:t>
+              <w:t>Escalfar suaument a la flama uns 8 minuts, fins que surtin vapors tènues. MAI no ha de bullir</w:t>
             </w:r>
           </w:p>
         </w:tc>
         <w:tc>
           <w:tcPr>
-            <w:tcW w:type="dxa" w:w="3118"/>
+            <w:tcW w:type="dxa" w:w="4195"/>
           </w:tcPr>
           <w:p>
             <w:pPr>
@@ -10668,7 +11584,7 @@
                 <w:color w:val="1A1A2E"/>
                 <w:sz w:val="18"/>
               </w:rPr>
-              <w:t>3, un de cada mida</w:t>
+              <w:t>L'àcid i la calor estovin el teixit i deixen entrar el colorant</w:t>
             </w:r>
           </w:p>
         </w:tc>
@@ -10676,7 +11592,7 @@
       <w:tr>
         <w:tc>
           <w:tcPr>
-            <w:tcW w:type="dxa" w:w="3628"/>
+            <w:tcW w:type="dxa" w:w="680"/>
             <w:shd w:val="clear" w:fill="F1E9F6"/>
           </w:tcPr>
           <w:p>
@@ -10691,13 +11607,13 @@
                 <w:color w:val="1A1A2E"/>
                 <w:sz w:val="18"/>
               </w:rPr>
-              <w:t>Xurros blaus (pare)</w:t>
+              <w:t>3</w:t>
             </w:r>
           </w:p>
         </w:tc>
         <w:tc>
           <w:tcPr>
-            <w:tcW w:type="dxa" w:w="3118"/>
+            <w:tcW w:type="dxa" w:w="4989"/>
           </w:tcPr>
           <w:p>
             <w:pPr>
@@ -10711,13 +11627,13 @@
                 <w:color w:val="1A1A2E"/>
                 <w:sz w:val="18"/>
               </w:rPr>
-              <w:t>2, un de cada mida</w:t>
+              <w:t>Posar una punta al portaobjectes amb una gota d'orceïna B i deixar-la actuar 1 minut</w:t>
             </w:r>
           </w:p>
         </w:tc>
         <w:tc>
           <w:tcPr>
-            <w:tcW w:type="dxa" w:w="3118"/>
+            <w:tcW w:type="dxa" w:w="4195"/>
           </w:tcPr>
           <w:p>
             <w:pPr>
@@ -10731,7 +11647,7 @@
                 <w:color w:val="1A1A2E"/>
                 <w:sz w:val="18"/>
               </w:rPr>
-              <w:t>3, un de cada mida</w:t>
+              <w:t>Tenyeix els cromosomes, que així es veuen</w:t>
             </w:r>
           </w:p>
         </w:tc>
@@ -10739,7 +11655,7 @@
       <w:tr>
         <w:tc>
           <w:tcPr>
-            <w:tcW w:type="dxa" w:w="3628"/>
+            <w:tcW w:type="dxa" w:w="680"/>
             <w:shd w:val="clear" w:fill="F1E9F6"/>
           </w:tcPr>
           <w:p>
@@ -10754,13 +11670,13 @@
                 <w:color w:val="1A1A2E"/>
                 <w:sz w:val="18"/>
               </w:rPr>
-              <w:t>Còpies (el mateix color i mida)</w:t>
+              <w:t>4</w:t>
             </w:r>
           </w:p>
         </w:tc>
         <w:tc>
           <w:tcPr>
-            <w:tcW w:type="dxa" w:w="3118"/>
+            <w:tcW w:type="dxa" w:w="4989"/>
           </w:tcPr>
           <w:p>
             <w:pPr>
@@ -10774,13 +11690,13 @@
                 <w:color w:val="1A1A2E"/>
                 <w:sz w:val="18"/>
               </w:rPr>
-              <w:t>4 més</w:t>
+              <w:t>Cobreobjectes, copets amb el mànec de l'agulla i 5-6 tires de paper de filtre a sobre; prémer fort amb el polze sense moure'l</w:t>
             </w:r>
           </w:p>
         </w:tc>
         <w:tc>
           <w:tcPr>
-            <w:tcW w:type="dxa" w:w="3118"/>
+            <w:tcW w:type="dxa" w:w="4195"/>
           </w:tcPr>
           <w:p>
             <w:pPr>
@@ -10794,7 +11710,7 @@
                 <w:color w:val="1A1A2E"/>
                 <w:sz w:val="18"/>
               </w:rPr>
-              <w:t>6 més</w:t>
+              <w:t>L'aixafament deixa les cèl·lules en una sola capa perquè la llum les travessi</w:t>
             </w:r>
           </w:p>
         </w:tc>
@@ -10802,7 +11718,7 @@
       <w:tr>
         <w:tc>
           <w:tcPr>
-            <w:tcW w:type="dxa" w:w="3628"/>
+            <w:tcW w:type="dxa" w:w="680"/>
             <w:shd w:val="clear" w:fill="F1E9F6"/>
           </w:tcPr>
           <w:p>
@@ -10817,13 +11733,13 @@
                 <w:color w:val="1A1A2E"/>
                 <w:sz w:val="18"/>
               </w:rPr>
-              <w:t>Cromosomes a la cèl·lula de partida</w:t>
+              <w:t>5</w:t>
             </w:r>
           </w:p>
         </w:tc>
         <w:tc>
           <w:tcPr>
-            <w:tcW w:type="dxa" w:w="3118"/>
+            <w:tcW w:type="dxa" w:w="4989"/>
           </w:tcPr>
           <w:p>
             <w:pPr>
@@ -10837,13 +11753,13 @@
                 <w:color w:val="1A1A2E"/>
                 <w:sz w:val="18"/>
               </w:rPr>
-              <w:t>4 (també un cop copiats)</w:t>
+              <w:t>Mirar al microscopi, trobar una cèl·lula de cada fase, fer-ne una foto amb el mòbil per l'ocular i comptar les cèl·lules d'un camp</w:t>
             </w:r>
           </w:p>
         </w:tc>
         <w:tc>
           <w:tcPr>
-            <w:tcW w:type="dxa" w:w="3118"/>
+            <w:tcW w:type="dxa" w:w="4195"/>
           </w:tcPr>
           <w:p>
             <w:pPr>
@@ -10857,133 +11773,7 @@
                 <w:color w:val="1A1A2E"/>
                 <w:sz w:val="18"/>
               </w:rPr>
-              <w:t>6 (també un cop copiats)</w:t>
-            </w:r>
-          </w:p>
-        </w:tc>
-      </w:tr>
-      <w:tr>
-        <w:tc>
-          <w:tcPr>
-            <w:tcW w:type="dxa" w:w="3628"/>
-            <w:shd w:val="clear" w:fill="F1E9F6"/>
-          </w:tcPr>
-          <w:p>
-            <w:pPr>
-              <w:spacing w:after="0" w:before="0"/>
-            </w:pPr>
-            <w:r>
-              <w:rPr>
-                <w:rFonts w:ascii="Fira Sans Extra Condensed" w:hAnsi="Fira Sans Extra Condensed" w:cs="Fira Sans Extra Condensed"/>
-                <w:b/>
-                <w:i w:val="0"/>
-                <w:color w:val="1A1A2E"/>
-                <w:sz w:val="18"/>
-              </w:rPr>
-              <w:t>Resultat de la mitosi</w:t>
-            </w:r>
-          </w:p>
-        </w:tc>
-        <w:tc>
-          <w:tcPr>
-            <w:tcW w:type="dxa" w:w="3118"/>
-          </w:tcPr>
-          <w:p>
-            <w:pPr>
-              <w:spacing w:after="0" w:before="0"/>
-            </w:pPr>
-            <w:r>
-              <w:rPr>
-                <w:rFonts w:ascii="Fira Sans Extra Condensed" w:hAnsi="Fira Sans Extra Condensed" w:cs="Fira Sans Extra Condensed"/>
-                <w:b w:val="0"/>
-                <w:i w:val="0"/>
-                <w:color w:val="1A1A2E"/>
-                <w:sz w:val="18"/>
-              </w:rPr>
-              <w:t>2 cèl·lules × 4</w:t>
-            </w:r>
-          </w:p>
-        </w:tc>
-        <w:tc>
-          <w:tcPr>
-            <w:tcW w:type="dxa" w:w="3118"/>
-          </w:tcPr>
-          <w:p>
-            <w:pPr>
-              <w:spacing w:after="0" w:before="0"/>
-            </w:pPr>
-            <w:r>
-              <w:rPr>
-                <w:rFonts w:ascii="Fira Sans Extra Condensed" w:hAnsi="Fira Sans Extra Condensed" w:cs="Fira Sans Extra Condensed"/>
-                <w:b w:val="0"/>
-                <w:i w:val="0"/>
-                <w:color w:val="1A1A2E"/>
-                <w:sz w:val="18"/>
-              </w:rPr>
-              <w:t>2 cèl·lules × 6</w:t>
-            </w:r>
-          </w:p>
-        </w:tc>
-      </w:tr>
-      <w:tr>
-        <w:tc>
-          <w:tcPr>
-            <w:tcW w:type="dxa" w:w="3628"/>
-            <w:shd w:val="clear" w:fill="F1E9F6"/>
-          </w:tcPr>
-          <w:p>
-            <w:pPr>
-              <w:spacing w:after="0" w:before="0"/>
-            </w:pPr>
-            <w:r>
-              <w:rPr>
-                <w:rFonts w:ascii="Fira Sans Extra Condensed" w:hAnsi="Fira Sans Extra Condensed" w:cs="Fira Sans Extra Condensed"/>
-                <w:b/>
-                <w:i w:val="0"/>
-                <w:color w:val="1A1A2E"/>
-                <w:sz w:val="18"/>
-              </w:rPr>
-              <w:t>Resultat de la meiosi</w:t>
-            </w:r>
-          </w:p>
-        </w:tc>
-        <w:tc>
-          <w:tcPr>
-            <w:tcW w:type="dxa" w:w="3118"/>
-          </w:tcPr>
-          <w:p>
-            <w:pPr>
-              <w:spacing w:after="0" w:before="0"/>
-            </w:pPr>
-            <w:r>
-              <w:rPr>
-                <w:rFonts w:ascii="Fira Sans Extra Condensed" w:hAnsi="Fira Sans Extra Condensed" w:cs="Fira Sans Extra Condensed"/>
-                <w:b w:val="0"/>
-                <w:i w:val="0"/>
-                <w:color w:val="1A1A2E"/>
-                <w:sz w:val="18"/>
-              </w:rPr>
-              <w:t>4 cèl·lules × 2 (un llarg + un curt)</w:t>
-            </w:r>
-          </w:p>
-        </w:tc>
-        <w:tc>
-          <w:tcPr>
-            <w:tcW w:type="dxa" w:w="3118"/>
-          </w:tcPr>
-          <w:p>
-            <w:pPr>
-              <w:spacing w:after="0" w:before="0"/>
-            </w:pPr>
-            <w:r>
-              <w:rPr>
-                <w:rFonts w:ascii="Fira Sans Extra Condensed" w:hAnsi="Fira Sans Extra Condensed" w:cs="Fira Sans Extra Condensed"/>
-                <w:b w:val="0"/>
-                <w:i w:val="0"/>
-                <w:color w:val="1A1A2E"/>
-                <w:sz w:val="18"/>
-              </w:rPr>
-              <w:t>4 cèl·lules × 3 (un de cada mida)</w:t>
+              <w:t>Primer índex mitòtic: cèl·lules en divisió ÷ total × 100</w:t>
             </w:r>
           </w:p>
         </w:tc>
@@ -11001,7 +11791,7 @@
           <w:color w:val="666666"/>
           <w:sz w:val="18"/>
         </w:rPr>
-        <w:t>La C fa una sola parella de partida (2 xurros del mateix color) amb els passos escrits al full. Plastilina, fils o netejapipes: el que hi hagi, però sempre amb 2 colors i mides diferents. Full A3 amb dos requadres (MITOSI · MEIOSI) per fer-hi els munts.</w:t>
+        <w:t>Seguretat: bata i guants per a tothom (l'orceïna taca i porta àcid), ulleres si n'hi ha, cabells recollits. Si una preparació no surt, en fan una altra amb una segona punta; si no hi ha manera, passen al laboratori virtual. Els passos són els de la fitxa B; la C porta les mateixes ordres més guiades, i la A afegeix les preguntes de justificació.</w:t>
       </w:r>
     </w:p>
     <w:p>
@@ -11136,7 +11926,7 @@
                 <w:color w:val="1A1A2E"/>
                 <w:sz w:val="18"/>
               </w:rPr>
-              <w:t>S1: la frase de la biòpsia (exit tiquet) · S4: diagnòstic dels casos i exit tiquet</w:t>
+              <w:t>S1: la frase de la biòpsia (exit tiquet) · S2: producte (el vídeo explica el procés) · S4: diagnòstic dels casos i prova escrita</w:t>
             </w:r>
           </w:p>
         </w:tc>
@@ -11179,7 +11969,7 @@
                 <w:color w:val="1A1A2E"/>
                 <w:sz w:val="18"/>
               </w:rPr>
-              <w:t>S2: el model de meiosi i l'exit tiquet dels germans</w:t>
+              <w:t>S2: l'exit tiquet dels germans i la comparació mitosi/meiosi · S4: prova escrita</w:t>
             </w:r>
           </w:p>
         </w:tc>
@@ -11222,7 +12012,7 @@
                 <w:color w:val="1A1A2E"/>
                 <w:sz w:val="18"/>
               </w:rPr>
-              <w:t>S3: què hauria de passar si el fàrmac frena la divisió</w:t>
+              <w:t>S3: què hauria de passar si el fàrmac frena la divisió · S4: casos de la fitxa</w:t>
             </w:r>
           </w:p>
         </w:tc>
@@ -11265,7 +12055,7 @@
                 <w:color w:val="1A1A2E"/>
                 <w:sz w:val="18"/>
               </w:rPr>
-              <w:t>S1: recompte del laboratori · S3: índex mitòtic, veredicte i exit tiquet</w:t>
+              <w:t>S1 i S2: recomptes del laboratori · S3: índex mitòtic, veredicte i exit tiquet</w:t>
             </w:r>
           </w:p>
         </w:tc>
@@ -11308,12 +12098,333 @@
                 <w:color w:val="1A1A2E"/>
                 <w:sz w:val="18"/>
               </w:rPr>
-              <w:t>S1–S4: càlculs (hores per fase, 23 + 23, índex mitòtic) i casos</w:t>
+              <w:t>S1–S4: càlculs (hores per fase, 23 + 23, índex mitòtic), casos i producte</w:t>
             </w:r>
           </w:p>
         </w:tc>
       </w:tr>
     </w:tbl>
+    <w:p>
+      <w:pPr>
+        <w:spacing w:before="200" w:after="60"/>
+      </w:pPr>
+      <w:r>
+        <w:rPr>
+          <w:rFonts w:ascii="Fira Sans Extra Condensed" w:hAnsi="Fira Sans Extra Condensed" w:cs="Fira Sans Extra Condensed"/>
+          <w:b/>
+          <w:i w:val="0"/>
+          <w:color w:val="7B3F9E"/>
+          <w:sz w:val="26"/>
+        </w:rPr>
+        <w:t>Additio: estructura d'avaluació</w:t>
+      </w:r>
+    </w:p>
+    <w:p>
+      <w:pPr>
+        <w:spacing w:before="0" w:after="60"/>
+      </w:pPr>
+      <w:r>
+        <w:rPr>
+          <w:rFonts w:ascii="Fira Sans Extra Condensed" w:hAnsi="Fira Sans Extra Condensed" w:cs="Fira Sans Extra Condensed"/>
+          <w:b w:val="0"/>
+          <w:i w:val="0"/>
+          <w:color w:val="1A1A2E"/>
+          <w:sz w:val="19"/>
+        </w:rPr>
+        <w:t>Codi per importar l'estructura de la SA2 de 4t a Additio (Estructures d'avaluació · Importar estructura al grup): AHJ1AV (generat el 07/10, amb l'estructura d'aleshores: encara porta 4 exit tiquets i la «maqueta»; cal regenerar-lo amb l'estructura de sota). No inclou alumnes ni notes. Si es genera un codi nou, aquest queda descartat.</w:t>
+      </w:r>
+    </w:p>
+    <w:tbl>
+      <w:tblPr>
+        <w:tblW w:type="auto" w:w="0"/>
+        <w:jc w:val="center"/>
+        <w:tblLayout w:type="fixed"/>
+        <w:tblLook w:firstColumn="1" w:firstRow="1" w:lastColumn="0" w:lastRow="0" w:noHBand="0" w:noVBand="1" w:val="04A0"/>
+        <w:tblBorders>
+          <w:top w:val="single" w:sz="4" w:color="D9C6E6"/>
+          <w:left w:val="single" w:sz="4" w:color="D9C6E6"/>
+          <w:bottom w:val="single" w:sz="4" w:color="D9C6E6"/>
+          <w:right w:val="single" w:sz="4" w:color="D9C6E6"/>
+          <w:insideH w:val="single" w:sz="4" w:color="D9C6E6"/>
+          <w:insideV w:val="single" w:sz="4" w:color="D9C6E6"/>
+        </w:tblBorders>
+        <w:tblLayout w:type="fixed"/>
+      </w:tblPr>
+      <w:tblGrid>
+        <w:gridCol w:w="1928"/>
+        <w:gridCol w:w="1361"/>
+        <w:gridCol w:w="6576"/>
+      </w:tblGrid>
+      <w:tr>
+        <w:tc>
+          <w:tcPr>
+            <w:tcW w:type="dxa" w:w="1928"/>
+            <w:shd w:val="clear" w:fill="7B3F9E"/>
+          </w:tcPr>
+          <w:p>
+            <w:pPr>
+              <w:spacing w:after="0" w:before="0"/>
+            </w:pPr>
+            <w:r>
+              <w:rPr>
+                <w:rFonts w:ascii="Fira Sans Extra Condensed" w:hAnsi="Fira Sans Extra Condensed" w:cs="Fira Sans Extra Condensed"/>
+                <w:b/>
+                <w:i w:val="0"/>
+                <w:color w:val="FFFFFF"/>
+                <w:sz w:val="19"/>
+              </w:rPr>
+              <w:t>Bloc</w:t>
+            </w:r>
+          </w:p>
+        </w:tc>
+        <w:tc>
+          <w:tcPr>
+            <w:tcW w:type="dxa" w:w="1361"/>
+            <w:shd w:val="clear" w:fill="7B3F9E"/>
+          </w:tcPr>
+          <w:p>
+            <w:pPr>
+              <w:spacing w:after="0" w:before="0"/>
+            </w:pPr>
+            <w:r>
+              <w:rPr>
+                <w:rFonts w:ascii="Fira Sans Extra Condensed" w:hAnsi="Fira Sans Extra Condensed" w:cs="Fira Sans Extra Condensed"/>
+                <w:b/>
+                <w:i w:val="0"/>
+                <w:color w:val="FFFFFF"/>
+                <w:sz w:val="19"/>
+              </w:rPr>
+              <w:t>% de la SA</w:t>
+            </w:r>
+          </w:p>
+        </w:tc>
+        <w:tc>
+          <w:tcPr>
+            <w:tcW w:type="dxa" w:w="6576"/>
+            <w:shd w:val="clear" w:fill="7B3F9E"/>
+          </w:tcPr>
+          <w:p>
+            <w:pPr>
+              <w:spacing w:after="0" w:before="0"/>
+            </w:pPr>
+            <w:r>
+              <w:rPr>
+                <w:rFonts w:ascii="Fira Sans Extra Condensed" w:hAnsi="Fira Sans Extra Condensed" w:cs="Fira Sans Extra Condensed"/>
+                <w:b/>
+                <w:i w:val="0"/>
+                <w:color w:val="FFFFFF"/>
+                <w:sz w:val="19"/>
+              </w:rPr>
+              <w:t>Columnes</w:t>
+            </w:r>
+          </w:p>
+        </w:tc>
+      </w:tr>
+      <w:tr>
+        <w:tc>
+          <w:tcPr>
+            <w:tcW w:type="dxa" w:w="1928"/>
+            <w:shd w:val="clear" w:fill="F1E9F6"/>
+          </w:tcPr>
+          <w:p>
+            <w:pPr>
+              <w:spacing w:after="0" w:before="0"/>
+            </w:pPr>
+            <w:r>
+              <w:rPr>
+                <w:rFonts w:ascii="Fira Sans Extra Condensed" w:hAnsi="Fira Sans Extra Condensed" w:cs="Fira Sans Extra Condensed"/>
+                <w:b/>
+                <w:i w:val="0"/>
+                <w:color w:val="1A1A2E"/>
+                <w:sz w:val="18"/>
+              </w:rPr>
+              <w:t>Formativa</w:t>
+            </w:r>
+          </w:p>
+        </w:tc>
+        <w:tc>
+          <w:tcPr>
+            <w:tcW w:type="dxa" w:w="1361"/>
+          </w:tcPr>
+          <w:p>
+            <w:pPr>
+              <w:spacing w:after="0" w:before="0"/>
+            </w:pPr>
+            <w:r>
+              <w:rPr>
+                <w:rFonts w:ascii="Fira Sans Extra Condensed" w:hAnsi="Fira Sans Extra Condensed" w:cs="Fira Sans Extra Condensed"/>
+                <w:b w:val="0"/>
+                <w:i w:val="0"/>
+                <w:color w:val="1A1A2E"/>
+                <w:sz w:val="18"/>
+              </w:rPr>
+              <w:t>20</w:t>
+            </w:r>
+          </w:p>
+        </w:tc>
+        <w:tc>
+          <w:tcPr>
+            <w:tcW w:type="dxa" w:w="6576"/>
+          </w:tcPr>
+          <w:p>
+            <w:pPr>
+              <w:spacing w:after="0" w:before="0"/>
+            </w:pPr>
+            <w:r>
+              <w:rPr>
+                <w:rFonts w:ascii="Fira Sans Extra Condensed" w:hAnsi="Fira Sans Extra Condensed" w:cs="Fira Sans Extra Condensed"/>
+                <w:b w:val="0"/>
+                <w:i w:val="0"/>
+                <w:color w:val="1A1A2E"/>
+                <w:sz w:val="18"/>
+              </w:rPr>
+              <w:t>Exit tiquet S1, S2, S3 (un terç cadascun; sense rúbrica, assoliments NA/AS/AN/AE)</w:t>
+            </w:r>
+          </w:p>
+        </w:tc>
+      </w:tr>
+      <w:tr>
+        <w:tc>
+          <w:tcPr>
+            <w:tcW w:type="dxa" w:w="1928"/>
+            <w:shd w:val="clear" w:fill="F1E9F6"/>
+          </w:tcPr>
+          <w:p>
+            <w:pPr>
+              <w:spacing w:after="0" w:before="0"/>
+            </w:pPr>
+            <w:r>
+              <w:rPr>
+                <w:rFonts w:ascii="Fira Sans Extra Condensed" w:hAnsi="Fira Sans Extra Condensed" w:cs="Fira Sans Extra Condensed"/>
+                <w:b/>
+                <w:i w:val="0"/>
+                <w:color w:val="1A1A2E"/>
+                <w:sz w:val="18"/>
+              </w:rPr>
+              <w:t>Producte</w:t>
+            </w:r>
+          </w:p>
+        </w:tc>
+        <w:tc>
+          <w:tcPr>
+            <w:tcW w:type="dxa" w:w="1361"/>
+          </w:tcPr>
+          <w:p>
+            <w:pPr>
+              <w:spacing w:after="0" w:before="0"/>
+            </w:pPr>
+            <w:r>
+              <w:rPr>
+                <w:rFonts w:ascii="Fira Sans Extra Condensed" w:hAnsi="Fira Sans Extra Condensed" w:cs="Fira Sans Extra Condensed"/>
+                <w:b w:val="0"/>
+                <w:i w:val="0"/>
+                <w:color w:val="1A1A2E"/>
+                <w:sz w:val="18"/>
+              </w:rPr>
+              <w:t>40</w:t>
+            </w:r>
+          </w:p>
+        </w:tc>
+        <w:tc>
+          <w:tcPr>
+            <w:tcW w:type="dxa" w:w="6576"/>
+          </w:tcPr>
+          <w:p>
+            <w:pPr>
+              <w:spacing w:after="0" w:before="0"/>
+            </w:pPr>
+            <w:r>
+              <w:rPr>
+                <w:rFonts w:ascii="Fira Sans Extra Condensed" w:hAnsi="Fira Sans Extra Condensed" w:cs="Fira Sans Extra Condensed"/>
+                <w:b w:val="0"/>
+                <w:i w:val="0"/>
+                <w:color w:val="1A1A2E"/>
+                <w:sz w:val="18"/>
+              </w:rPr>
+              <w:t>Vídeo del procés + informe diagnòstic (75 %) · rúbrica BiG4, amb LCAT 3.1 a «Comunicació i defensa»; Índex mitòtic (laboratori) + veredicte del cas (25 %) · rúbrica BiG4</w:t>
+            </w:r>
+          </w:p>
+        </w:tc>
+      </w:tr>
+      <w:tr>
+        <w:tc>
+          <w:tcPr>
+            <w:tcW w:type="dxa" w:w="1928"/>
+            <w:shd w:val="clear" w:fill="F1E9F6"/>
+          </w:tcPr>
+          <w:p>
+            <w:pPr>
+              <w:spacing w:after="0" w:before="0"/>
+            </w:pPr>
+            <w:r>
+              <w:rPr>
+                <w:rFonts w:ascii="Fira Sans Extra Condensed" w:hAnsi="Fira Sans Extra Condensed" w:cs="Fira Sans Extra Condensed"/>
+                <w:b/>
+                <w:i w:val="0"/>
+                <w:color w:val="1A1A2E"/>
+                <w:sz w:val="18"/>
+              </w:rPr>
+              <w:t>Prova</w:t>
+            </w:r>
+          </w:p>
+        </w:tc>
+        <w:tc>
+          <w:tcPr>
+            <w:tcW w:type="dxa" w:w="1361"/>
+          </w:tcPr>
+          <w:p>
+            <w:pPr>
+              <w:spacing w:after="0" w:before="0"/>
+            </w:pPr>
+            <w:r>
+              <w:rPr>
+                <w:rFonts w:ascii="Fira Sans Extra Condensed" w:hAnsi="Fira Sans Extra Condensed" w:cs="Fira Sans Extra Condensed"/>
+                <w:b w:val="0"/>
+                <w:i w:val="0"/>
+                <w:color w:val="1A1A2E"/>
+                <w:sz w:val="18"/>
+              </w:rPr>
+              <w:t>40</w:t>
+            </w:r>
+          </w:p>
+        </w:tc>
+        <w:tc>
+          <w:tcPr>
+            <w:tcW w:type="dxa" w:w="6576"/>
+          </w:tcPr>
+          <w:p>
+            <w:pPr>
+              <w:spacing w:after="0" w:before="0"/>
+            </w:pPr>
+            <w:r>
+              <w:rPr>
+                <w:rFonts w:ascii="Fira Sans Extra Condensed" w:hAnsi="Fira Sans Extra Condensed" w:cs="Fira Sans Extra Condensed"/>
+                <w:b w:val="0"/>
+                <w:i w:val="0"/>
+                <w:color w:val="1A1A2E"/>
+                <w:sz w:val="18"/>
+              </w:rPr>
+              <w:t>Prova escrita SA2 (S4, segona hora) · rúbrica BiG4 amb una fila per OA</w:t>
+            </w:r>
+          </w:p>
+        </w:tc>
+      </w:tr>
+    </w:tbl>
+    <w:p>
+      <w:pPr>
+        <w:spacing w:before="60" w:after="40"/>
+      </w:pPr>
+      <w:r>
+        <w:rPr>
+          <w:rFonts w:ascii="Fira Sans Extra Condensed" w:hAnsi="Fira Sans Extra Condensed" w:cs="Fira Sans Extra Condensed"/>
+          <w:b w:val="0"/>
+          <w:i w:val="0"/>
+          <w:color w:val="666666"/>
+          <w:sz w:val="18"/>
+        </w:rPr>
+        <w:t>Les columnes amb rúbrica no porten competències ni criteris propis: els aporta cada fila de la rúbrica. La pestanya de deures (Fet / Fet a mitges / No fet) la crea el docent. No hi ha quizzes: els exit tiquets són en paper. Repartiment de blocs 20/40/40, pes interior de Producte 75/25, pes de competència 3 i el canvi a tres exit tiquets i a vídeo + informe: decisions per confirmar.</w:t>
+      </w:r>
+    </w:p>
     <w:p>
       <w:pPr>
         <w:spacing w:after="120" w:before="0"/>

</xml_diff>